<commit_message>
update: 2026-09-20~09-30 各期 + 57 个生词
</commit_message>
<xml_diff>
--- a/生词本/单词本.docx
+++ b/生词本/单词本.docx
@@ -2786,6 +2786,2400 @@
             <w:tcW w:type="dxa" w:w="2160"/>
           </w:tcPr>
           <w:p/>
+        </w:tc>
+      </w:tr>
+      <w:tr>
+        <w:tc>
+          <w:tcPr>
+            <w:tcW w:type="dxa" w:w="2160"/>
+          </w:tcPr>
+          <w:p>
+            <w:r>
+              <w:t>precocious</w:t>
+            </w:r>
+          </w:p>
+        </w:tc>
+        <w:tc>
+          <w:tcPr>
+            <w:tcW w:type="dxa" w:w="2160"/>
+          </w:tcPr>
+          <w:p>
+            <w:r>
+              <w:t>adj.</w:t>
+            </w:r>
+          </w:p>
+        </w:tc>
+        <w:tc>
+          <w:tcPr>
+            <w:tcW w:type="dxa" w:w="2160"/>
+          </w:tcPr>
+          <w:p>
+            <w:r>
+              <w:t>早熟的，早慧的；原文 Hsu was a precocious talent and became a professional skateboarder in his mid-teens（少年成名）；名词 precocity</w:t>
+            </w:r>
+          </w:p>
+        </w:tc>
+        <w:tc>
+          <w:tcPr>
+            <w:tcW w:type="dxa" w:w="2160"/>
+          </w:tcPr>
+          <w:p>
+            <w:r>
+              <w:t>2026-09-30</w:t>
+            </w:r>
+          </w:p>
+        </w:tc>
+      </w:tr>
+      <w:tr>
+        <w:tc>
+          <w:tcPr>
+            <w:tcW w:type="dxa" w:w="2160"/>
+          </w:tcPr>
+          <w:p>
+            <w:r>
+              <w:t>macabre</w:t>
+            </w:r>
+          </w:p>
+        </w:tc>
+        <w:tc>
+          <w:tcPr>
+            <w:tcW w:type="dxa" w:w="2160"/>
+          </w:tcPr>
+          <w:p>
+            <w:r>
+              <w:t>adj.</w:t>
+            </w:r>
+          </w:p>
+        </w:tc>
+        <w:tc>
+          <w:tcPr>
+            <w:tcW w:type="dxa" w:w="2160"/>
+          </w:tcPr>
+          <w:p>
+            <w:r>
+              <w:t>阴森可怖的，令人毛骨悚然的（多与死亡、恐怖相关）；原文 the strange, funny, often macabre things he came across</w:t>
+            </w:r>
+          </w:p>
+        </w:tc>
+        <w:tc>
+          <w:tcPr>
+            <w:tcW w:type="dxa" w:w="2160"/>
+          </w:tcPr>
+          <w:p>
+            <w:r>
+              <w:t>2026-09-30</w:t>
+            </w:r>
+          </w:p>
+        </w:tc>
+      </w:tr>
+      <w:tr>
+        <w:tc>
+          <w:tcPr>
+            <w:tcW w:type="dxa" w:w="2160"/>
+          </w:tcPr>
+          <w:p>
+            <w:r>
+              <w:t>procure</w:t>
+            </w:r>
+          </w:p>
+        </w:tc>
+        <w:tc>
+          <w:tcPr>
+            <w:tcW w:type="dxa" w:w="2160"/>
+          </w:tcPr>
+          <w:p>
+            <w:r>
+              <w:t>v.</w:t>
+            </w:r>
+          </w:p>
+        </w:tc>
+        <w:tc>
+          <w:tcPr>
+            <w:tcW w:type="dxa" w:w="2160"/>
+          </w:tcPr>
+          <w:p>
+            <w:r>
+              <w:t>（设法）取得，弄到；procure sb sth 为某人弄到某物；原文 She famously procured him a concrete parking block（他妈妈弄来一块水泥台供他练滑板）</w:t>
+            </w:r>
+          </w:p>
+        </w:tc>
+        <w:tc>
+          <w:tcPr>
+            <w:tcW w:type="dxa" w:w="2160"/>
+          </w:tcPr>
+          <w:p>
+            <w:r>
+              <w:t>2026-09-30</w:t>
+            </w:r>
+          </w:p>
+        </w:tc>
+      </w:tr>
+      <w:tr>
+        <w:tc>
+          <w:tcPr>
+            <w:tcW w:type="dxa" w:w="2160"/>
+          </w:tcPr>
+          <w:p>
+            <w:r>
+              <w:t>inscrutable</w:t>
+            </w:r>
+          </w:p>
+        </w:tc>
+        <w:tc>
+          <w:tcPr>
+            <w:tcW w:type="dxa" w:w="2160"/>
+          </w:tcPr>
+          <w:p>
+            <w:r>
+              <w:t>adj.</w:t>
+            </w:r>
+          </w:p>
+        </w:tc>
+        <w:tc>
+          <w:tcPr>
+            <w:tcW w:type="dxa" w:w="2160"/>
+          </w:tcPr>
+          <w:p>
+            <w:r>
+              <w:t>难以捉摸的，高深莫测的（an inscrutable smile）；原文 portraits full of dazed, inscrutable expressions</w:t>
+            </w:r>
+          </w:p>
+        </w:tc>
+        <w:tc>
+          <w:tcPr>
+            <w:tcW w:type="dxa" w:w="2160"/>
+          </w:tcPr>
+          <w:p>
+            <w:r>
+              <w:t>2026-09-30</w:t>
+            </w:r>
+          </w:p>
+        </w:tc>
+      </w:tr>
+      <w:tr>
+        <w:tc>
+          <w:tcPr>
+            <w:tcW w:type="dxa" w:w="2160"/>
+          </w:tcPr>
+          <w:p>
+            <w:r>
+              <w:t>foreboding</w:t>
+            </w:r>
+          </w:p>
+        </w:tc>
+        <w:tc>
+          <w:tcPr>
+            <w:tcW w:type="dxa" w:w="2160"/>
+          </w:tcPr>
+          <w:p>
+            <w:r>
+              <w:t>n. / adj.</w:t>
+            </w:r>
+          </w:p>
+        </w:tc>
+        <w:tc>
+          <w:tcPr>
+            <w:tcW w:type="dxa" w:w="2160"/>
+          </w:tcPr>
+          <w:p>
+            <w:r>
+              <w:t>n. 不祥预感（a sense of foreboding）；adj. 不祥的；原文 a flower bush sequestered behind a foreboding fence</w:t>
+            </w:r>
+          </w:p>
+        </w:tc>
+        <w:tc>
+          <w:tcPr>
+            <w:tcW w:type="dxa" w:w="2160"/>
+          </w:tcPr>
+          <w:p>
+            <w:r>
+              <w:t>2026-09-30</w:t>
+            </w:r>
+          </w:p>
+        </w:tc>
+      </w:tr>
+      <w:tr>
+        <w:tc>
+          <w:tcPr>
+            <w:tcW w:type="dxa" w:w="2160"/>
+          </w:tcPr>
+          <w:p>
+            <w:r>
+              <w:t>uncanny</w:t>
+            </w:r>
+          </w:p>
+        </w:tc>
+        <w:tc>
+          <w:tcPr>
+            <w:tcW w:type="dxa" w:w="2160"/>
+          </w:tcPr>
+          <w:p>
+            <w:r>
+              <w:t>adj.</w:t>
+            </w:r>
+          </w:p>
+        </w:tc>
+        <w:tc>
+          <w:tcPr>
+            <w:tcW w:type="dxa" w:w="2160"/>
+          </w:tcPr>
+          <w:p>
+            <w:r>
+              <w:t>诡异的，超乎寻常的，不可思议的（an uncanny resemblance）；原文 a sixth sense for stumbling upon bizarre, uncanny scenes</w:t>
+            </w:r>
+          </w:p>
+        </w:tc>
+        <w:tc>
+          <w:tcPr>
+            <w:tcW w:type="dxa" w:w="2160"/>
+          </w:tcPr>
+          <w:p>
+            <w:r>
+              <w:t>2026-09-30</w:t>
+            </w:r>
+          </w:p>
+        </w:tc>
+      </w:tr>
+      <w:tr>
+        <w:tc>
+          <w:tcPr>
+            <w:tcW w:type="dxa" w:w="2160"/>
+          </w:tcPr>
+          <w:p>
+            <w:r>
+              <w:t>sublime</w:t>
+            </w:r>
+          </w:p>
+        </w:tc>
+        <w:tc>
+          <w:tcPr>
+            <w:tcW w:type="dxa" w:w="2160"/>
+          </w:tcPr>
+          <w:p>
+            <w:r>
+              <w:t>adj.</w:t>
+            </w:r>
+          </w:p>
+        </w:tc>
+        <w:tc>
+          <w:tcPr>
+            <w:tcW w:type="dxa" w:w="2160"/>
+          </w:tcPr>
+          <w:p>
+            <w:r>
+              <w:t>崇高的，壮美的，超凡的（the sublime 崇高之美）；原文 there are pictures that feel sublime and vast</w:t>
+            </w:r>
+          </w:p>
+        </w:tc>
+        <w:tc>
+          <w:tcPr>
+            <w:tcW w:type="dxa" w:w="2160"/>
+          </w:tcPr>
+          <w:p>
+            <w:r>
+              <w:t>2026-09-30</w:t>
+            </w:r>
+          </w:p>
+        </w:tc>
+      </w:tr>
+      <w:tr>
+        <w:tc>
+          <w:tcPr>
+            <w:tcW w:type="dxa" w:w="2160"/>
+          </w:tcPr>
+          <w:p>
+            <w:r>
+              <w:t>sovereign</w:t>
+            </w:r>
+          </w:p>
+        </w:tc>
+        <w:tc>
+          <w:tcPr>
+            <w:tcW w:type="dxa" w:w="2160"/>
+          </w:tcPr>
+          <w:p>
+            <w:r>
+              <w:t>adj. / n.</w:t>
+            </w:r>
+          </w:p>
+        </w:tc>
+        <w:tc>
+          <w:tcPr>
+            <w:tcW w:type="dxa" w:w="2160"/>
+          </w:tcPr>
+          <w:p>
+            <w:r>
+              <w:t>主权的；sovereign bonds / sovereign debt 主权债券/主权债务；n. 君主；原文 most rich-world sovereign bonds are safe</w:t>
+            </w:r>
+          </w:p>
+        </w:tc>
+        <w:tc>
+          <w:tcPr>
+            <w:tcW w:type="dxa" w:w="2160"/>
+          </w:tcPr>
+          <w:p>
+            <w:r>
+              <w:t>2026-09-30</w:t>
+            </w:r>
+          </w:p>
+        </w:tc>
+      </w:tr>
+      <w:tr>
+        <w:tc>
+          <w:tcPr>
+            <w:tcW w:type="dxa" w:w="2160"/>
+          </w:tcPr>
+          <w:p>
+            <w:r>
+              <w:t>offset</w:t>
+            </w:r>
+          </w:p>
+        </w:tc>
+        <w:tc>
+          <w:tcPr>
+            <w:tcW w:type="dxa" w:w="2160"/>
+          </w:tcPr>
+          <w:p>
+            <w:r>
+              <w:t>v. / n.</w:t>
+            </w:r>
+          </w:p>
+        </w:tc>
+        <w:tc>
+          <w:tcPr>
+            <w:tcW w:type="dxa" w:w="2160"/>
+          </w:tcPr>
+          <w:p>
+            <w:r>
+              <w:t>抵消，补偿（offset the volatility of stocks 对冲股市波动）；原文 Bonds helpfully offset the volatility of stocks by gaining value during recessions</w:t>
+            </w:r>
+          </w:p>
+        </w:tc>
+        <w:tc>
+          <w:tcPr>
+            <w:tcW w:type="dxa" w:w="2160"/>
+          </w:tcPr>
+          <w:p>
+            <w:r>
+              <w:t>2026-09-30</w:t>
+            </w:r>
+          </w:p>
+        </w:tc>
+      </w:tr>
+      <w:tr>
+        <w:tc>
+          <w:tcPr>
+            <w:tcW w:type="dxa" w:w="2160"/>
+          </w:tcPr>
+          <w:p>
+            <w:r>
+              <w:t>deficit</w:t>
+            </w:r>
+          </w:p>
+        </w:tc>
+        <w:tc>
+          <w:tcPr>
+            <w:tcW w:type="dxa" w:w="2160"/>
+          </w:tcPr>
+          <w:p>
+            <w:r>
+              <w:t>n.</w:t>
+            </w:r>
+          </w:p>
+        </w:tc>
+        <w:tc>
+          <w:tcPr>
+            <w:tcW w:type="dxa" w:w="2160"/>
+          </w:tcPr>
+          <w:p>
+            <w:r>
+              <w:t>赤字，亏空（budget / fiscal deficit 预算/财政赤字；反义 surplus 盈余）；原文 seldom outside wartime or recessions have rich-world deficits been higher</w:t>
+            </w:r>
+          </w:p>
+        </w:tc>
+        <w:tc>
+          <w:tcPr>
+            <w:tcW w:type="dxa" w:w="2160"/>
+          </w:tcPr>
+          <w:p>
+            <w:r>
+              <w:t>2026-09-30</w:t>
+            </w:r>
+          </w:p>
+        </w:tc>
+      </w:tr>
+      <w:tr>
+        <w:tc>
+          <w:tcPr>
+            <w:tcW w:type="dxa" w:w="2160"/>
+          </w:tcPr>
+          <w:p>
+            <w:r>
+              <w:t>dormant</w:t>
+            </w:r>
+          </w:p>
+        </w:tc>
+        <w:tc>
+          <w:tcPr>
+            <w:tcW w:type="dxa" w:w="2160"/>
+          </w:tcPr>
+          <w:p>
+            <w:r>
+              <w:t>adj.</w:t>
+            </w:r>
+          </w:p>
+        </w:tc>
+        <w:tc>
+          <w:tcPr>
+            <w:tcW w:type="dxa" w:w="2160"/>
+          </w:tcPr>
+          <w:p>
+            <w:r>
+              <w:t>休眠的，蛰伏的，暂时沉寂的（lie dormant 蛰伏不动；dormant volcano 休眠火山）；原文 After lying dormant for decades, yields are surging even in Japan</w:t>
+            </w:r>
+          </w:p>
+        </w:tc>
+        <w:tc>
+          <w:tcPr>
+            <w:tcW w:type="dxa" w:w="2160"/>
+          </w:tcPr>
+          <w:p>
+            <w:r>
+              <w:t>2026-09-30</w:t>
+            </w:r>
+          </w:p>
+        </w:tc>
+      </w:tr>
+      <w:tr>
+        <w:tc>
+          <w:tcPr>
+            <w:tcW w:type="dxa" w:w="2160"/>
+          </w:tcPr>
+          <w:p>
+            <w:r>
+              <w:t>surge</w:t>
+            </w:r>
+          </w:p>
+        </w:tc>
+        <w:tc>
+          <w:tcPr>
+            <w:tcW w:type="dxa" w:w="2160"/>
+          </w:tcPr>
+          <w:p>
+            <w:r>
+              <w:t>v. / n.</w:t>
+            </w:r>
+          </w:p>
+        </w:tc>
+        <w:tc>
+          <w:tcPr>
+            <w:tcW w:type="dxa" w:w="2160"/>
+          </w:tcPr>
+          <w:p>
+            <w:r>
+              <w:t>激增，猛涨；（浪）汹涌；a surge in prices / inflation；原文 yields are surging even in Japan（连日本的收益率都在飙升）</w:t>
+            </w:r>
+          </w:p>
+        </w:tc>
+        <w:tc>
+          <w:tcPr>
+            <w:tcW w:type="dxa" w:w="2160"/>
+          </w:tcPr>
+          <w:p>
+            <w:r>
+              <w:t>2026-09-30</w:t>
+            </w:r>
+          </w:p>
+        </w:tc>
+      </w:tr>
+      <w:tr>
+        <w:tc>
+          <w:tcPr>
+            <w:tcW w:type="dxa" w:w="2160"/>
+          </w:tcPr>
+          <w:p>
+            <w:r>
+              <w:t>volatile</w:t>
+            </w:r>
+          </w:p>
+        </w:tc>
+        <w:tc>
+          <w:tcPr>
+            <w:tcW w:type="dxa" w:w="2160"/>
+          </w:tcPr>
+          <w:p>
+            <w:r>
+              <w:t>adj.</w:t>
+            </w:r>
+          </w:p>
+        </w:tc>
+        <w:tc>
+          <w:tcPr>
+            <w:tcW w:type="dxa" w:w="2160"/>
+          </w:tcPr>
+          <w:p>
+            <w:r>
+              <w:t>（行情、局势、脾气）反复无常的，易变的（a volatile bond market）；名词 volatility（市场）波动性</w:t>
+            </w:r>
+          </w:p>
+        </w:tc>
+        <w:tc>
+          <w:tcPr>
+            <w:tcW w:type="dxa" w:w="2160"/>
+          </w:tcPr>
+          <w:p>
+            <w:r>
+              <w:t>2026-09-30</w:t>
+            </w:r>
+          </w:p>
+        </w:tc>
+      </w:tr>
+      <w:tr>
+        <w:tc>
+          <w:tcPr>
+            <w:tcW w:type="dxa" w:w="2160"/>
+          </w:tcPr>
+          <w:p>
+            <w:r>
+              <w:t>inflammable</w:t>
+            </w:r>
+          </w:p>
+        </w:tc>
+        <w:tc>
+          <w:tcPr>
+            <w:tcW w:type="dxa" w:w="2160"/>
+          </w:tcPr>
+          <w:p>
+            <w:r>
+              <w:t>adj.</w:t>
+            </w:r>
+          </w:p>
+        </w:tc>
+        <w:tc>
+          <w:tcPr>
+            <w:tcW w:type="dxa" w:w="2160"/>
+          </w:tcPr>
+          <w:p>
+            <w:r>
+              <w:t>易燃的；一触即发的，易激化的；原文 short-term debt and a volatile bond market make for an inflammable mix；⚠️ inflammable = flammable（都是易燃），“不易燃”是 non-flammable，别把 in- 当否定前缀</w:t>
+            </w:r>
+          </w:p>
+        </w:tc>
+        <w:tc>
+          <w:tcPr>
+            <w:tcW w:type="dxa" w:w="2160"/>
+          </w:tcPr>
+          <w:p>
+            <w:r>
+              <w:t>2026-09-30</w:t>
+            </w:r>
+          </w:p>
+        </w:tc>
+      </w:tr>
+      <w:tr>
+        <w:tc>
+          <w:tcPr>
+            <w:tcW w:type="dxa" w:w="2160"/>
+          </w:tcPr>
+          <w:p>
+            <w:r>
+              <w:t>populist</w:t>
+            </w:r>
+          </w:p>
+        </w:tc>
+        <w:tc>
+          <w:tcPr>
+            <w:tcW w:type="dxa" w:w="2160"/>
+          </w:tcPr>
+          <w:p>
+            <w:r>
+              <w:t>n. / adj.</w:t>
+            </w:r>
+          </w:p>
+        </w:tc>
+        <w:tc>
+          <w:tcPr>
+            <w:tcW w:type="dxa" w:w="2160"/>
+          </w:tcPr>
+          <w:p>
+            <w:r>
+              <w:t>民粹主义者（的），平民主义的；原文 big-spending populists are looking strong ahead of a presidential election</w:t>
+            </w:r>
+          </w:p>
+        </w:tc>
+        <w:tc>
+          <w:tcPr>
+            <w:tcW w:type="dxa" w:w="2160"/>
+          </w:tcPr>
+          <w:p>
+            <w:r>
+              <w:t>2026-09-30</w:t>
+            </w:r>
+          </w:p>
+        </w:tc>
+      </w:tr>
+      <w:tr>
+        <w:tc>
+          <w:tcPr>
+            <w:tcW w:type="dxa" w:w="2160"/>
+          </w:tcPr>
+          <w:p>
+            <w:r>
+              <w:t>vie</w:t>
+            </w:r>
+          </w:p>
+        </w:tc>
+        <w:tc>
+          <w:tcPr>
+            <w:tcW w:type="dxa" w:w="2160"/>
+          </w:tcPr>
+          <w:p>
+            <w:r>
+              <w:t>v.</w:t>
+            </w:r>
+          </w:p>
+        </w:tc>
+        <w:tc>
+          <w:tcPr>
+            <w:tcW w:type="dxa" w:w="2160"/>
+          </w:tcPr>
+          <w:p>
+            <w:r>
+              <w:t>竞争，争夺（vie for sth / vie to do sth；过去式、过去分词 vied）；原文 Democrats and Republicans are vying to promise ever-bigger cheques</w:t>
+            </w:r>
+          </w:p>
+        </w:tc>
+        <w:tc>
+          <w:tcPr>
+            <w:tcW w:type="dxa" w:w="2160"/>
+          </w:tcPr>
+          <w:p>
+            <w:r>
+              <w:t>2026-09-30</w:t>
+            </w:r>
+          </w:p>
+        </w:tc>
+      </w:tr>
+      <w:tr>
+        <w:tc>
+          <w:tcPr>
+            <w:tcW w:type="dxa" w:w="2160"/>
+          </w:tcPr>
+          <w:p>
+            <w:r>
+              <w:t>futile</w:t>
+            </w:r>
+          </w:p>
+        </w:tc>
+        <w:tc>
+          <w:tcPr>
+            <w:tcW w:type="dxa" w:w="2160"/>
+          </w:tcPr>
+          <w:p>
+            <w:r>
+              <w:t>adj.</w:t>
+            </w:r>
+          </w:p>
+        </w:tc>
+        <w:tc>
+          <w:tcPr>
+            <w:tcW w:type="dxa" w:w="2160"/>
+          </w:tcPr>
+          <w:p>
+            <w:r>
+              <w:t>徒劳的，无益的（a futile attempt / effort）；原文 a futile attempt to suppress yields（美国财长压收益率的徒劳尝试）</w:t>
+            </w:r>
+          </w:p>
+        </w:tc>
+        <w:tc>
+          <w:tcPr>
+            <w:tcW w:type="dxa" w:w="2160"/>
+          </w:tcPr>
+          <w:p>
+            <w:r>
+              <w:t>2026-09-30</w:t>
+            </w:r>
+          </w:p>
+        </w:tc>
+      </w:tr>
+      <w:tr>
+        <w:tc>
+          <w:tcPr>
+            <w:tcW w:type="dxa" w:w="2160"/>
+          </w:tcPr>
+          <w:p>
+            <w:r>
+              <w:t>hegemony</w:t>
+            </w:r>
+          </w:p>
+        </w:tc>
+        <w:tc>
+          <w:tcPr>
+            <w:tcW w:type="dxa" w:w="2160"/>
+          </w:tcPr>
+          <w:p>
+            <w:r>
+              <w:t>n.</w:t>
+            </w:r>
+          </w:p>
+        </w:tc>
+        <w:tc>
+          <w:tcPr>
+            <w:tcW w:type="dxa" w:w="2160"/>
+          </w:tcPr>
+          <w:p>
+            <w:r>
+              <w:t>霸权，支配地位（enjoy hegemony over…；hegemon 霸主）；原文 For decades America has enjoyed hegemony over the Middle East</w:t>
+            </w:r>
+          </w:p>
+        </w:tc>
+        <w:tc>
+          <w:tcPr>
+            <w:tcW w:type="dxa" w:w="2160"/>
+          </w:tcPr>
+          <w:p>
+            <w:r>
+              <w:t>2026-09-30</w:t>
+            </w:r>
+          </w:p>
+        </w:tc>
+      </w:tr>
+      <w:tr>
+        <w:tc>
+          <w:tcPr>
+            <w:tcW w:type="dxa" w:w="2160"/>
+          </w:tcPr>
+          <w:p>
+            <w:r>
+              <w:t>retrenchment</w:t>
+            </w:r>
+          </w:p>
+        </w:tc>
+        <w:tc>
+          <w:tcPr>
+            <w:tcW w:type="dxa" w:w="2160"/>
+          </w:tcPr>
+          <w:p>
+            <w:r>
+              <w:t>n.</w:t>
+            </w:r>
+          </w:p>
+        </w:tc>
+        <w:tc>
+          <w:tcPr>
+            <w:tcW w:type="dxa" w:w="2160"/>
+          </w:tcPr>
+          <w:p>
+            <w:r>
+              <w:t>（军力、开支的）收缩，紧缩（military retrenchment 战略收缩；动词 retrench）；原文 The signs of America's looming retrenchment are unmistakable</w:t>
+            </w:r>
+          </w:p>
+        </w:tc>
+        <w:tc>
+          <w:tcPr>
+            <w:tcW w:type="dxa" w:w="2160"/>
+          </w:tcPr>
+          <w:p>
+            <w:r>
+              <w:t>2026-09-30</w:t>
+            </w:r>
+          </w:p>
+        </w:tc>
+      </w:tr>
+      <w:tr>
+        <w:tc>
+          <w:tcPr>
+            <w:tcW w:type="dxa" w:w="2160"/>
+          </w:tcPr>
+          <w:p>
+            <w:r>
+              <w:t>relinquish</w:t>
+            </w:r>
+          </w:p>
+        </w:tc>
+        <w:tc>
+          <w:tcPr>
+            <w:tcW w:type="dxa" w:w="2160"/>
+          </w:tcPr>
+          <w:p>
+            <w:r>
+              <w:t>v.</w:t>
+            </w:r>
+          </w:p>
+        </w:tc>
+        <w:tc>
+          <w:tcPr>
+            <w:tcW w:type="dxa" w:w="2160"/>
+          </w:tcPr>
+          <w:p>
+            <w:r>
+              <w:t>（不情愿地）交出，放弃（权力、领地等）（relinquish power / control）；原文 the moment when America finally relinquishes its hegemony there</w:t>
+            </w:r>
+          </w:p>
+        </w:tc>
+        <w:tc>
+          <w:tcPr>
+            <w:tcW w:type="dxa" w:w="2160"/>
+          </w:tcPr>
+          <w:p>
+            <w:r>
+              <w:t>2026-09-30</w:t>
+            </w:r>
+          </w:p>
+        </w:tc>
+      </w:tr>
+      <w:tr>
+        <w:tc>
+          <w:tcPr>
+            <w:tcW w:type="dxa" w:w="2160"/>
+          </w:tcPr>
+          <w:p>
+            <w:r>
+              <w:t>dismember</w:t>
+            </w:r>
+          </w:p>
+        </w:tc>
+        <w:tc>
+          <w:tcPr>
+            <w:tcW w:type="dxa" w:w="2160"/>
+          </w:tcPr>
+          <w:p>
+            <w:r>
+              <w:t>v.</w:t>
+            </w:r>
+          </w:p>
+        </w:tc>
+        <w:tc>
+          <w:tcPr>
+            <w:tcW w:type="dxa" w:w="2160"/>
+          </w:tcPr>
+          <w:p>
+            <w:r>
+              <w:t>瓜分，肢解（国家、帝国）；dis-（分开）+ member（肢体）；原文 the great powers dismembered the Ottoman empire（百年前列强瓜分奥斯曼帝国）</w:t>
+            </w:r>
+          </w:p>
+        </w:tc>
+        <w:tc>
+          <w:tcPr>
+            <w:tcW w:type="dxa" w:w="2160"/>
+          </w:tcPr>
+          <w:p>
+            <w:r>
+              <w:t>2026-09-30</w:t>
+            </w:r>
+          </w:p>
+        </w:tc>
+      </w:tr>
+      <w:tr>
+        <w:tc>
+          <w:tcPr>
+            <w:tcW w:type="dxa" w:w="2160"/>
+          </w:tcPr>
+          <w:p>
+            <w:r>
+              <w:t>herald</w:t>
+            </w:r>
+          </w:p>
+        </w:tc>
+        <w:tc>
+          <w:tcPr>
+            <w:tcW w:type="dxa" w:w="2160"/>
+          </w:tcPr>
+          <w:p>
+            <w:r>
+              <w:t>v. / n.</w:t>
+            </w:r>
+          </w:p>
+        </w:tc>
+        <w:tc>
+          <w:tcPr>
+            <w:tcW w:type="dxa" w:w="2160"/>
+          </w:tcPr>
+          <w:p>
+            <w:r>
+              <w:t>v. 预示……的来临，宣告；n. 先驱，预兆；原文 Will that herald an orgy of score-settling and violence, or a new beginning?</w:t>
+            </w:r>
+          </w:p>
+        </w:tc>
+        <w:tc>
+          <w:tcPr>
+            <w:tcW w:type="dxa" w:w="2160"/>
+          </w:tcPr>
+          <w:p>
+            <w:r>
+              <w:t>2026-09-30</w:t>
+            </w:r>
+          </w:p>
+        </w:tc>
+      </w:tr>
+      <w:tr>
+        <w:tc>
+          <w:tcPr>
+            <w:tcW w:type="dxa" w:w="2160"/>
+          </w:tcPr>
+          <w:p>
+            <w:r>
+              <w:t>covert</w:t>
+            </w:r>
+          </w:p>
+        </w:tc>
+        <w:tc>
+          <w:tcPr>
+            <w:tcW w:type="dxa" w:w="2160"/>
+          </w:tcPr>
+          <w:p>
+            <w:r>
+              <w:t>adj.</w:t>
+            </w:r>
+          </w:p>
+        </w:tc>
+        <w:tc>
+          <w:tcPr>
+            <w:tcW w:type="dxa" w:w="2160"/>
+          </w:tcPr>
+          <w:p>
+            <w:r>
+              <w:t>秘密的，暗中的（covert operations 隐蔽行动；covert support 暗中支持；反义 overt 公开的）；原文 After three wars, countless covert operations and endless diplomacy…</w:t>
+            </w:r>
+          </w:p>
+        </w:tc>
+        <w:tc>
+          <w:tcPr>
+            <w:tcW w:type="dxa" w:w="2160"/>
+          </w:tcPr>
+          <w:p>
+            <w:r>
+              <w:t>2026-09-30</w:t>
+            </w:r>
+          </w:p>
+        </w:tc>
+      </w:tr>
+      <w:tr>
+        <w:tc>
+          <w:tcPr>
+            <w:tcW w:type="dxa" w:w="2160"/>
+          </w:tcPr>
+          <w:p>
+            <w:r>
+              <w:t>malign</w:t>
+            </w:r>
+          </w:p>
+        </w:tc>
+        <w:tc>
+          <w:tcPr>
+            <w:tcW w:type="dxa" w:w="2160"/>
+          </w:tcPr>
+          <w:p>
+            <w:r>
+              <w:t>adj.</w:t>
+            </w:r>
+          </w:p>
+        </w:tc>
+        <w:tc>
+          <w:tcPr>
+            <w:tcW w:type="dxa" w:w="2160"/>
+          </w:tcPr>
+          <w:p>
+            <w:r>
+              <w:t>恶意的，有害的（a malign influence）；v. 诽谤，中伤；原文 it will be in no position to rebuild its malign influence across Iraq, Syria and Lebanon</w:t>
+            </w:r>
+          </w:p>
+        </w:tc>
+        <w:tc>
+          <w:tcPr>
+            <w:tcW w:type="dxa" w:w="2160"/>
+          </w:tcPr>
+          <w:p>
+            <w:r>
+              <w:t>2026-09-30</w:t>
+            </w:r>
+          </w:p>
+        </w:tc>
+      </w:tr>
+      <w:tr>
+        <w:tc>
+          <w:tcPr>
+            <w:tcW w:type="dxa" w:w="2160"/>
+          </w:tcPr>
+          <w:p>
+            <w:r>
+              <w:t>colossal</w:t>
+            </w:r>
+          </w:p>
+        </w:tc>
+        <w:tc>
+          <w:tcPr>
+            <w:tcW w:type="dxa" w:w="2160"/>
+          </w:tcPr>
+          <w:p>
+            <w:r>
+              <w:t>adj.</w:t>
+            </w:r>
+          </w:p>
+        </w:tc>
+        <w:tc>
+          <w:tcPr>
+            <w:tcW w:type="dxa" w:w="2160"/>
+          </w:tcPr>
+          <w:p>
+            <w:r>
+              <w:t>巨大的，惊人的（a colossal exporter / a colossal failure；词源同罗德岛巨像 Colossus）；原文 today it is a colossal exporter</w:t>
+            </w:r>
+          </w:p>
+        </w:tc>
+        <w:tc>
+          <w:tcPr>
+            <w:tcW w:type="dxa" w:w="2160"/>
+          </w:tcPr>
+          <w:p>
+            <w:r>
+              <w:t>2026-09-30</w:t>
+            </w:r>
+          </w:p>
+        </w:tc>
+      </w:tr>
+      <w:tr>
+        <w:tc>
+          <w:tcPr>
+            <w:tcW w:type="dxa" w:w="2160"/>
+          </w:tcPr>
+          <w:p>
+            <w:r>
+              <w:t>pragmatic</w:t>
+            </w:r>
+          </w:p>
+        </w:tc>
+        <w:tc>
+          <w:tcPr>
+            <w:tcW w:type="dxa" w:w="2160"/>
+          </w:tcPr>
+          <w:p>
+            <w:r>
+              <w:t>adj.</w:t>
+            </w:r>
+          </w:p>
+        </w:tc>
+        <w:tc>
+          <w:tcPr>
+            <w:tcW w:type="dxa" w:w="2160"/>
+          </w:tcPr>
+          <w:p>
+            <w:r>
+              <w:t>务实的，重实效的（反义 ideological 教条的）；原文 Although it has championed the Muslim Brotherhood, it is more pragmatic than ideological</w:t>
+            </w:r>
+          </w:p>
+        </w:tc>
+        <w:tc>
+          <w:tcPr>
+            <w:tcW w:type="dxa" w:w="2160"/>
+          </w:tcPr>
+          <w:p>
+            <w:r>
+              <w:t>2026-09-30</w:t>
+            </w:r>
+          </w:p>
+        </w:tc>
+      </w:tr>
+      <w:tr>
+        <w:tc>
+          <w:tcPr>
+            <w:tcW w:type="dxa" w:w="2160"/>
+          </w:tcPr>
+          <w:p>
+            <w:r>
+              <w:t>yearn</w:t>
+            </w:r>
+          </w:p>
+        </w:tc>
+        <w:tc>
+          <w:tcPr>
+            <w:tcW w:type="dxa" w:w="2160"/>
+          </w:tcPr>
+          <w:p>
+            <w:r>
+              <w:t>v.</w:t>
+            </w:r>
+          </w:p>
+        </w:tc>
+        <w:tc>
+          <w:tcPr>
+            <w:tcW w:type="dxa" w:w="2160"/>
+          </w:tcPr>
+          <w:p>
+            <w:r>
+              <w:t>渴望，向往（yearn for sth / yearn to do sth）；原文 Arabs have long yearned for a chance to recover lost glory</w:t>
+            </w:r>
+          </w:p>
+        </w:tc>
+        <w:tc>
+          <w:tcPr>
+            <w:tcW w:type="dxa" w:w="2160"/>
+          </w:tcPr>
+          <w:p>
+            <w:r>
+              <w:t>2026-09-30</w:t>
+            </w:r>
+          </w:p>
+        </w:tc>
+      </w:tr>
+      <w:tr>
+        <w:tc>
+          <w:tcPr>
+            <w:tcW w:type="dxa" w:w="2160"/>
+          </w:tcPr>
+          <w:p>
+            <w:r>
+              <w:t>eerie</w:t>
+            </w:r>
+          </w:p>
+        </w:tc>
+        <w:tc>
+          <w:tcPr>
+            <w:tcW w:type="dxa" w:w="2160"/>
+          </w:tcPr>
+          <w:p>
+            <w:r>
+              <w:t>adj.</w:t>
+            </w:r>
+          </w:p>
+        </w:tc>
+        <w:tc>
+          <w:tcPr>
+            <w:tcW w:type="dxa" w:w="2160"/>
+          </w:tcPr>
+          <w:p>
+            <w:r>
+              <w:t>怪异而可怕的，阴森的（an eerie silence / eerie light）；原文 extracting deep pathos from the characters' eerie reckonings</w:t>
+            </w:r>
+          </w:p>
+        </w:tc>
+        <w:tc>
+          <w:tcPr>
+            <w:tcW w:type="dxa" w:w="2160"/>
+          </w:tcPr>
+          <w:p>
+            <w:r>
+              <w:t>2026-09-30</w:t>
+            </w:r>
+          </w:p>
+        </w:tc>
+      </w:tr>
+      <w:tr>
+        <w:tc>
+          <w:tcPr>
+            <w:tcW w:type="dxa" w:w="2160"/>
+          </w:tcPr>
+          <w:p>
+            <w:r>
+              <w:t>melancholy</w:t>
+            </w:r>
+          </w:p>
+        </w:tc>
+        <w:tc>
+          <w:tcPr>
+            <w:tcW w:type="dxa" w:w="2160"/>
+          </w:tcPr>
+          <w:p>
+            <w:r>
+              <w:t>n. / adj.</w:t>
+            </w:r>
+          </w:p>
+        </w:tc>
+        <w:tc>
+          <w:tcPr>
+            <w:tcW w:type="dxa" w:w="2160"/>
+          </w:tcPr>
+          <w:p>
+            <w:r>
+              <w:t>忧郁，悲哀；忧郁的（the melancholy of a life's experience 岁月带来的忧愁）；近义 gloom，melancholy 更文雅</w:t>
+            </w:r>
+          </w:p>
+        </w:tc>
+        <w:tc>
+          <w:tcPr>
+            <w:tcW w:type="dxa" w:w="2160"/>
+          </w:tcPr>
+          <w:p>
+            <w:r>
+              <w:t>2026-09-30</w:t>
+            </w:r>
+          </w:p>
+        </w:tc>
+      </w:tr>
+      <w:tr>
+        <w:tc>
+          <w:tcPr>
+            <w:tcW w:type="dxa" w:w="2160"/>
+          </w:tcPr>
+          <w:p>
+            <w:r>
+              <w:t>milieu</w:t>
+            </w:r>
+          </w:p>
+        </w:tc>
+        <w:tc>
+          <w:tcPr>
+            <w:tcW w:type="dxa" w:w="2160"/>
+          </w:tcPr>
+          <w:p>
+            <w:r>
+              <w:t>n.</w:t>
+            </w:r>
+          </w:p>
+        </w:tc>
+        <w:tc>
+          <w:tcPr>
+            <w:tcW w:type="dxa" w:w="2160"/>
+          </w:tcPr>
+          <w:p>
+            <w:r>
+              <w:t>（社交、艺术）环境，圈子（源自法语，读 /miːˈljɜː/）；原文 a double-decker drama set in the film milieu of Madrid</w:t>
+            </w:r>
+          </w:p>
+        </w:tc>
+        <w:tc>
+          <w:tcPr>
+            <w:tcW w:type="dxa" w:w="2160"/>
+          </w:tcPr>
+          <w:p>
+            <w:r>
+              <w:t>2026-09-30</w:t>
+            </w:r>
+          </w:p>
+        </w:tc>
+      </w:tr>
+      <w:tr>
+        <w:tc>
+          <w:tcPr>
+            <w:tcW w:type="dxa" w:w="2160"/>
+          </w:tcPr>
+          <w:p>
+            <w:r>
+              <w:t>hard-nosed</w:t>
+            </w:r>
+          </w:p>
+        </w:tc>
+        <w:tc>
+          <w:tcPr>
+            <w:tcW w:type="dxa" w:w="2160"/>
+          </w:tcPr>
+          <w:p>
+            <w:r>
+              <w:t>adj.</w:t>
+            </w:r>
+          </w:p>
+        </w:tc>
+        <w:tc>
+          <w:tcPr>
+            <w:tcW w:type="dxa" w:w="2160"/>
+          </w:tcPr>
+          <w:p>
+            <w:r>
+              <w:t>精明的，不动感情的，讲实际的（a hard-nosed businesswoman 精明的女商人）</w:t>
+            </w:r>
+          </w:p>
+        </w:tc>
+        <w:tc>
+          <w:tcPr>
+            <w:tcW w:type="dxa" w:w="2160"/>
+          </w:tcPr>
+          <w:p>
+            <w:r>
+              <w:t>2026-09-30</w:t>
+            </w:r>
+          </w:p>
+        </w:tc>
+      </w:tr>
+      <w:tr>
+        <w:tc>
+          <w:tcPr>
+            <w:tcW w:type="dxa" w:w="2160"/>
+          </w:tcPr>
+          <w:p>
+            <w:r>
+              <w:t>idiosyncratic</w:t>
+            </w:r>
+          </w:p>
+        </w:tc>
+        <w:tc>
+          <w:tcPr>
+            <w:tcW w:type="dxa" w:w="2160"/>
+          </w:tcPr>
+          <w:p>
+            <w:r>
+              <w:t>adj.</w:t>
+            </w:r>
+          </w:p>
+        </w:tc>
+        <w:tc>
+          <w:tcPr>
+            <w:tcW w:type="dxa" w:w="2160"/>
+          </w:tcPr>
+          <w:p>
+            <w:r>
+              <w:t>独特的，怪癖的（名词 idiosyncrasy 个人特质、怪癖）；原文 a documentary about an idiosyncratic artist and archivist</w:t>
+            </w:r>
+          </w:p>
+        </w:tc>
+        <w:tc>
+          <w:tcPr>
+            <w:tcW w:type="dxa" w:w="2160"/>
+          </w:tcPr>
+          <w:p>
+            <w:r>
+              <w:t>2026-09-30</w:t>
+            </w:r>
+          </w:p>
+        </w:tc>
+      </w:tr>
+      <w:tr>
+        <w:tc>
+          <w:tcPr>
+            <w:tcW w:type="dxa" w:w="2160"/>
+          </w:tcPr>
+          <w:p>
+            <w:r>
+              <w:t>purport</w:t>
+            </w:r>
+          </w:p>
+        </w:tc>
+        <w:tc>
+          <w:tcPr>
+            <w:tcW w:type="dxa" w:w="2160"/>
+          </w:tcPr>
+          <w:p>
+            <w:r>
+              <w:t>v.</w:t>
+            </w:r>
+          </w:p>
+        </w:tc>
+        <w:tc>
+          <w:tcPr>
+            <w:tcW w:type="dxa" w:w="2160"/>
+          </w:tcPr>
+          <w:p>
+            <w:r>
+              <w:t>声称，自诩，号称（purport to be / do sth，常含“未必属实”之意）；原文 a solo show that purports to stage every book of the Penguin Classics series</w:t>
+            </w:r>
+          </w:p>
+        </w:tc>
+        <w:tc>
+          <w:tcPr>
+            <w:tcW w:type="dxa" w:w="2160"/>
+          </w:tcPr>
+          <w:p>
+            <w:r>
+              <w:t>2026-09-30</w:t>
+            </w:r>
+          </w:p>
+        </w:tc>
+      </w:tr>
+      <w:tr>
+        <w:tc>
+          <w:tcPr>
+            <w:tcW w:type="dxa" w:w="2160"/>
+          </w:tcPr>
+          <w:p>
+            <w:r>
+              <w:t>repertoire</w:t>
+            </w:r>
+          </w:p>
+        </w:tc>
+        <w:tc>
+          <w:tcPr>
+            <w:tcW w:type="dxa" w:w="2160"/>
+          </w:tcPr>
+          <w:p>
+            <w:r>
+              <w:t>n.</w:t>
+            </w:r>
+          </w:p>
+        </w:tc>
+        <w:tc>
+          <w:tcPr>
+            <w:tcW w:type="dxa" w:w="2160"/>
+          </w:tcPr>
+          <w:p>
+            <w:r>
+              <w:t>（剧团、演员的）全部曲目、保留节目；（喻）看家本领（a broad repertoire of skills）；原文 Hoffs brings an expanded repertoire to a five-night residency</w:t>
+            </w:r>
+          </w:p>
+        </w:tc>
+        <w:tc>
+          <w:tcPr>
+            <w:tcW w:type="dxa" w:w="2160"/>
+          </w:tcPr>
+          <w:p>
+            <w:r>
+              <w:t>2026-09-30</w:t>
+            </w:r>
+          </w:p>
+        </w:tc>
+      </w:tr>
+      <w:tr>
+        <w:tc>
+          <w:tcPr>
+            <w:tcW w:type="dxa" w:w="2160"/>
+          </w:tcPr>
+          <w:p>
+            <w:r>
+              <w:t>frivolous</w:t>
+            </w:r>
+          </w:p>
+        </w:tc>
+        <w:tc>
+          <w:tcPr>
+            <w:tcW w:type="dxa" w:w="2160"/>
+          </w:tcPr>
+          <w:p>
+            <w:r>
+              <w:t>adj.</w:t>
+            </w:r>
+          </w:p>
+        </w:tc>
+        <w:tc>
+          <w:tcPr>
+            <w:tcW w:type="dxa" w:w="2160"/>
+          </w:tcPr>
+          <w:p>
+            <w:r>
+              <w:t>轻浮的，无聊的，不严肃的（frivolous spending）；原文 The world of fashion is often thought of as frivolous—more spangles than substance</w:t>
+            </w:r>
+          </w:p>
+        </w:tc>
+        <w:tc>
+          <w:tcPr>
+            <w:tcW w:type="dxa" w:w="2160"/>
+          </w:tcPr>
+          <w:p>
+            <w:r>
+              <w:t>2026-09-30</w:t>
+            </w:r>
+          </w:p>
+        </w:tc>
+      </w:tr>
+      <w:tr>
+        <w:tc>
+          <w:tcPr>
+            <w:tcW w:type="dxa" w:w="2160"/>
+          </w:tcPr>
+          <w:p>
+            <w:r>
+              <w:t>sanguine</w:t>
+            </w:r>
+          </w:p>
+        </w:tc>
+        <w:tc>
+          <w:tcPr>
+            <w:tcW w:type="dxa" w:w="2160"/>
+          </w:tcPr>
+          <w:p>
+            <w:r>
+              <w:t>adj.</w:t>
+            </w:r>
+          </w:p>
+        </w:tc>
+        <w:tc>
+          <w:tcPr>
+            <w:tcW w:type="dxa" w:w="2160"/>
+          </w:tcPr>
+          <w:p>
+            <w:r>
+              <w:t>乐观的，满怀信心的（be sanguine about sth；比 optimistic 更书面）；原文 even the most sanguine of designers can crack under the pressure</w:t>
+            </w:r>
+          </w:p>
+        </w:tc>
+        <w:tc>
+          <w:tcPr>
+            <w:tcW w:type="dxa" w:w="2160"/>
+          </w:tcPr>
+          <w:p>
+            <w:r>
+              <w:t>2026-09-30</w:t>
+            </w:r>
+          </w:p>
+        </w:tc>
+      </w:tr>
+      <w:tr>
+        <w:tc>
+          <w:tcPr>
+            <w:tcW w:type="dxa" w:w="2160"/>
+          </w:tcPr>
+          <w:p>
+            <w:r>
+              <w:t>slump</w:t>
+            </w:r>
+          </w:p>
+        </w:tc>
+        <w:tc>
+          <w:tcPr>
+            <w:tcW w:type="dxa" w:w="2160"/>
+          </w:tcPr>
+          <w:p>
+            <w:r>
+              <w:t>v. / n.</w:t>
+            </w:r>
+          </w:p>
+        </w:tc>
+        <w:tc>
+          <w:tcPr>
+            <w:tcW w:type="dxa" w:w="2160"/>
+          </w:tcPr>
+          <w:p>
+            <w:r>
+              <w:t>（价格、经济）暴跌，衰退，萧条（a housing slump 房市萧条；slump into a chair 瘫坐）；原文 The last benefit of a housing slump is to remind people that houses are a poor long-term investment</w:t>
+            </w:r>
+          </w:p>
+        </w:tc>
+        <w:tc>
+          <w:tcPr>
+            <w:tcW w:type="dxa" w:w="2160"/>
+          </w:tcPr>
+          <w:p>
+            <w:r>
+              <w:t>2026-09-30</w:t>
+            </w:r>
+          </w:p>
+        </w:tc>
+      </w:tr>
+      <w:tr>
+        <w:tc>
+          <w:tcPr>
+            <w:tcW w:type="dxa" w:w="2160"/>
+          </w:tcPr>
+          <w:p>
+            <w:r>
+              <w:t>lavish</w:t>
+            </w:r>
+          </w:p>
+        </w:tc>
+        <w:tc>
+          <w:tcPr>
+            <w:tcW w:type="dxa" w:w="2160"/>
+          </w:tcPr>
+          <w:p>
+            <w:r>
+              <w:t>adj. / v.</w:t>
+            </w:r>
+          </w:p>
+        </w:tc>
+        <w:tc>
+          <w:tcPr>
+            <w:tcW w:type="dxa" w:w="2160"/>
+          </w:tcPr>
+          <w:p>
+            <w:r>
+              <w:t>奢华的，铺张的（a lavish lifestyle）；v. 慷慨给予（lavish sth on / upon sb）；原文 governments have told households to treat their homes as saving vehicles, and lavished them with tax breaks</w:t>
+            </w:r>
+          </w:p>
+        </w:tc>
+        <w:tc>
+          <w:tcPr>
+            <w:tcW w:type="dxa" w:w="2160"/>
+          </w:tcPr>
+          <w:p>
+            <w:r>
+              <w:t>2026-09-30</w:t>
+            </w:r>
+          </w:p>
+        </w:tc>
+      </w:tr>
+      <w:tr>
+        <w:tc>
+          <w:tcPr>
+            <w:tcW w:type="dxa" w:w="2160"/>
+          </w:tcPr>
+          <w:p>
+            <w:r>
+              <w:t>tenet</w:t>
+            </w:r>
+          </w:p>
+        </w:tc>
+        <w:tc>
+          <w:tcPr>
+            <w:tcW w:type="dxa" w:w="2160"/>
+          </w:tcPr>
+          <w:p>
+            <w:r>
+              <w:t>n.</w:t>
+            </w:r>
+          </w:p>
+        </w:tc>
+        <w:tc>
+          <w:tcPr>
+            <w:tcW w:type="dxa" w:w="2160"/>
+          </w:tcPr>
+          <w:p>
+            <w:r>
+              <w:t>信条，原则（basic tenets of investing 投资的基本信条）；原文 treating your house as a financial asset violates some basic tenets of investing</w:t>
+            </w:r>
+          </w:p>
+        </w:tc>
+        <w:tc>
+          <w:tcPr>
+            <w:tcW w:type="dxa" w:w="2160"/>
+          </w:tcPr>
+          <w:p>
+            <w:r>
+              <w:t>2026-09-30</w:t>
+            </w:r>
+          </w:p>
+        </w:tc>
+      </w:tr>
+      <w:tr>
+        <w:tc>
+          <w:tcPr>
+            <w:tcW w:type="dxa" w:w="2160"/>
+          </w:tcPr>
+          <w:p>
+            <w:r>
+              <w:t>dilute</w:t>
+            </w:r>
+          </w:p>
+        </w:tc>
+        <w:tc>
+          <w:tcPr>
+            <w:tcW w:type="dxa" w:w="2160"/>
+          </w:tcPr>
+          <w:p>
+            <w:r>
+              <w:t>v.</w:t>
+            </w:r>
+          </w:p>
+        </w:tc>
+        <w:tc>
+          <w:tcPr>
+            <w:tcW w:type="dxa" w:w="2160"/>
+          </w:tcPr>
+          <w:p>
+            <w:r>
+              <w:t>稀释；削弱，冲淡（dilute the value / effect）；原文 the greater the NIMBY temptation to block development, which could dilute its value</w:t>
+            </w:r>
+          </w:p>
+        </w:tc>
+        <w:tc>
+          <w:tcPr>
+            <w:tcW w:type="dxa" w:w="2160"/>
+          </w:tcPr>
+          <w:p>
+            <w:r>
+              <w:t>2026-09-30</w:t>
+            </w:r>
+          </w:p>
+        </w:tc>
+      </w:tr>
+      <w:tr>
+        <w:tc>
+          <w:tcPr>
+            <w:tcW w:type="dxa" w:w="2160"/>
+          </w:tcPr>
+          <w:p>
+            <w:r>
+              <w:t>trappings</w:t>
+            </w:r>
+          </w:p>
+        </w:tc>
+        <w:tc>
+          <w:tcPr>
+            <w:tcW w:type="dxa" w:w="2160"/>
+          </w:tcPr>
+          <w:p>
+            <w:r>
+              <w:t>n. [pl.]</w:t>
+            </w:r>
+          </w:p>
+        </w:tc>
+        <w:tc>
+          <w:tcPr>
+            <w:tcW w:type="dxa" w:w="2160"/>
+          </w:tcPr>
+          <w:p>
+            <w:r>
+              <w:t>（复数）外在标志，排场，行头（the trappings of civilization / power 权力的外衣）；原文 daydreamed about sloughing off the trappings of civilization and roughing it</w:t>
+            </w:r>
+          </w:p>
+        </w:tc>
+        <w:tc>
+          <w:tcPr>
+            <w:tcW w:type="dxa" w:w="2160"/>
+          </w:tcPr>
+          <w:p>
+            <w:r>
+              <w:t>2026-09-30</w:t>
+            </w:r>
+          </w:p>
+        </w:tc>
+      </w:tr>
+      <w:tr>
+        <w:tc>
+          <w:tcPr>
+            <w:tcW w:type="dxa" w:w="2160"/>
+          </w:tcPr>
+          <w:p>
+            <w:r>
+              <w:t>churn out</w:t>
+            </w:r>
+          </w:p>
+        </w:tc>
+        <w:tc>
+          <w:tcPr>
+            <w:tcW w:type="dxa" w:w="2160"/>
+          </w:tcPr>
+          <w:p>
+            <w:r>
+              <w:t>phr.</w:t>
+            </w:r>
+          </w:p>
+        </w:tc>
+        <w:tc>
+          <w:tcPr>
+            <w:tcW w:type="dxa" w:w="2160"/>
+          </w:tcPr>
+          <w:p>
+            <w:r>
+              <w:t>（大量而机械地）炮制，批量产出；原文 the content mill, which churns out “trad” influencers, survivalist reality shows</w:t>
+            </w:r>
+          </w:p>
+        </w:tc>
+        <w:tc>
+          <w:tcPr>
+            <w:tcW w:type="dxa" w:w="2160"/>
+          </w:tcPr>
+          <w:p>
+            <w:r>
+              <w:t>2026-09-30</w:t>
+            </w:r>
+          </w:p>
+        </w:tc>
+      </w:tr>
+      <w:tr>
+        <w:tc>
+          <w:tcPr>
+            <w:tcW w:type="dxa" w:w="2160"/>
+          </w:tcPr>
+          <w:p>
+            <w:r>
+              <w:t>illicit</w:t>
+            </w:r>
+          </w:p>
+        </w:tc>
+        <w:tc>
+          <w:tcPr>
+            <w:tcW w:type="dxa" w:w="2160"/>
+          </w:tcPr>
+          <w:p>
+            <w:r>
+              <w:t>adj.</w:t>
+            </w:r>
+          </w:p>
+        </w:tc>
+        <w:tc>
+          <w:tcPr>
+            <w:tcW w:type="dxa" w:w="2160"/>
+          </w:tcPr>
+          <w:p>
+            <w:r>
+              <w:t>非法的，违禁的（illicit drugs 毒品；an illicit affair 私情）；⚠️不要和 elicit（v. 引出、套出）混淆；原文 not to mention a fair amount of illicit drugs</w:t>
+            </w:r>
+          </w:p>
+        </w:tc>
+        <w:tc>
+          <w:tcPr>
+            <w:tcW w:type="dxa" w:w="2160"/>
+          </w:tcPr>
+          <w:p>
+            <w:r>
+              <w:t>2026-09-30</w:t>
+            </w:r>
+          </w:p>
+        </w:tc>
+      </w:tr>
+      <w:tr>
+        <w:tc>
+          <w:tcPr>
+            <w:tcW w:type="dxa" w:w="2160"/>
+          </w:tcPr>
+          <w:p>
+            <w:r>
+              <w:t>hefty</w:t>
+            </w:r>
+          </w:p>
+        </w:tc>
+        <w:tc>
+          <w:tcPr>
+            <w:tcW w:type="dxa" w:w="2160"/>
+          </w:tcPr>
+          <w:p>
+            <w:r>
+              <w:t>adj.</w:t>
+            </w:r>
+          </w:p>
+        </w:tc>
+        <w:tc>
+          <w:tcPr>
+            <w:tcW w:type="dxa" w:w="2160"/>
+          </w:tcPr>
+          <w:p>
+            <w:r>
+              <w:t>大而沉重的；（数量）可观的，巨额的（a hefty fine 一笔巨额罚款）；原文 In a hefty, ambitious new book</w:t>
+            </w:r>
+          </w:p>
+        </w:tc>
+        <w:tc>
+          <w:tcPr>
+            <w:tcW w:type="dxa" w:w="2160"/>
+          </w:tcPr>
+          <w:p>
+            <w:r>
+              <w:t>2026-09-30</w:t>
+            </w:r>
+          </w:p>
+        </w:tc>
+      </w:tr>
+      <w:tr>
+        <w:tc>
+          <w:tcPr>
+            <w:tcW w:type="dxa" w:w="2160"/>
+          </w:tcPr>
+          <w:p>
+            <w:r>
+              <w:t>exuberant</w:t>
+            </w:r>
+          </w:p>
+        </w:tc>
+        <w:tc>
+          <w:tcPr>
+            <w:tcW w:type="dxa" w:w="2160"/>
+          </w:tcPr>
+          <w:p>
+            <w:r>
+              <w:t>adj.</w:t>
+            </w:r>
+          </w:p>
+        </w:tc>
+        <w:tc>
+          <w:tcPr>
+            <w:tcW w:type="dxa" w:w="2160"/>
+          </w:tcPr>
+          <w:p>
+            <w:r>
+              <w:t>热情洋溢的，生机勃勃的，茂盛的（an exuberant face；名词 exuberance）；原文 The exuberant faces and lithe bodies seen in old photographs have become weathered</w:t>
+            </w:r>
+          </w:p>
+        </w:tc>
+        <w:tc>
+          <w:tcPr>
+            <w:tcW w:type="dxa" w:w="2160"/>
+          </w:tcPr>
+          <w:p>
+            <w:r>
+              <w:t>2026-09-30</w:t>
+            </w:r>
+          </w:p>
+        </w:tc>
+      </w:tr>
+      <w:tr>
+        <w:tc>
+          <w:tcPr>
+            <w:tcW w:type="dxa" w:w="2160"/>
+          </w:tcPr>
+          <w:p>
+            <w:r>
+              <w:t>lament</w:t>
+            </w:r>
+          </w:p>
+        </w:tc>
+        <w:tc>
+          <w:tcPr>
+            <w:tcW w:type="dxa" w:w="2160"/>
+          </w:tcPr>
+          <w:p>
+            <w:r>
+              <w:t>v. / n.</w:t>
+            </w:r>
+          </w:p>
+        </w:tc>
+        <w:tc>
+          <w:tcPr>
+            <w:tcW w:type="dxa" w:w="2160"/>
+          </w:tcPr>
+          <w:p>
+            <w:r>
+              <w:t>悲叹，痛惜；n. 挽歌，哀诗；原文 manage to compose both a lament for a dying dream and a paean to the visionaries who dreamed it</w:t>
+            </w:r>
+          </w:p>
+        </w:tc>
+        <w:tc>
+          <w:tcPr>
+            <w:tcW w:type="dxa" w:w="2160"/>
+          </w:tcPr>
+          <w:p>
+            <w:r>
+              <w:t>2026-09-30</w:t>
+            </w:r>
+          </w:p>
+        </w:tc>
+      </w:tr>
+      <w:tr>
+        <w:tc>
+          <w:tcPr>
+            <w:tcW w:type="dxa" w:w="2160"/>
+          </w:tcPr>
+          <w:p>
+            <w:r>
+              <w:t>eccentric</w:t>
+            </w:r>
+          </w:p>
+        </w:tc>
+        <w:tc>
+          <w:tcPr>
+            <w:tcW w:type="dxa" w:w="2160"/>
+          </w:tcPr>
+          <w:p>
+            <w:r>
+              <w:t>adj. / n.</w:t>
+            </w:r>
+          </w:p>
+        </w:tc>
+        <w:tc>
+          <w:tcPr>
+            <w:tcW w:type="dxa" w:w="2160"/>
+          </w:tcPr>
+          <w:p>
+            <w:r>
+              <w:t>古怪的，怪癖的；n. 怪人（an eccentric individual；eccentric habits）；原文 living autobiographies, inextricable from the eccentric individuals who built and inhabited them</w:t>
+            </w:r>
+          </w:p>
+        </w:tc>
+        <w:tc>
+          <w:tcPr>
+            <w:tcW w:type="dxa" w:w="2160"/>
+          </w:tcPr>
+          <w:p>
+            <w:r>
+              <w:t>2026-09-30</w:t>
+            </w:r>
+          </w:p>
+        </w:tc>
+      </w:tr>
+      <w:tr>
+        <w:tc>
+          <w:tcPr>
+            <w:tcW w:type="dxa" w:w="2160"/>
+          </w:tcPr>
+          <w:p>
+            <w:r>
+              <w:t>eye-watering</w:t>
+            </w:r>
+          </w:p>
+        </w:tc>
+        <w:tc>
+          <w:tcPr>
+            <w:tcW w:type="dxa" w:w="2160"/>
+          </w:tcPr>
+          <w:p>
+            <w:r>
+              <w:t>adj.</w:t>
+            </w:r>
+          </w:p>
+        </w:tc>
+        <w:tc>
+          <w:tcPr>
+            <w:tcW w:type="dxa" w:w="2160"/>
+          </w:tcPr>
+          <w:p>
+            <w:r>
+              <w:t>（数字）高得吓人的，天价的（eye-watering rents / prices / fees）；原文 our current age of eye-watering rents and astronomical home prices</w:t>
+            </w:r>
+          </w:p>
+        </w:tc>
+        <w:tc>
+          <w:tcPr>
+            <w:tcW w:type="dxa" w:w="2160"/>
+          </w:tcPr>
+          <w:p>
+            <w:r>
+              <w:t>2026-09-30</w:t>
+            </w:r>
+          </w:p>
+        </w:tc>
+      </w:tr>
+      <w:tr>
+        <w:tc>
+          <w:tcPr>
+            <w:tcW w:type="dxa" w:w="2160"/>
+          </w:tcPr>
+          <w:p>
+            <w:r>
+              <w:t>stagnate</w:t>
+            </w:r>
+          </w:p>
+        </w:tc>
+        <w:tc>
+          <w:tcPr>
+            <w:tcW w:type="dxa" w:w="2160"/>
+          </w:tcPr>
+          <w:p>
+            <w:r>
+              <w:t>v.</w:t>
+            </w:r>
+          </w:p>
+        </w:tc>
+        <w:tc>
+          <w:tcPr>
+            <w:tcW w:type="dxa" w:w="2160"/>
+          </w:tcPr>
+          <w:p>
+            <w:r>
+              <w:t>停滞，不发展（the economy has stagnated 经济陷入停滞）；形容词 stagnant（一潭死水式的，不流动的）；原文 Brazil's economy has stagnated relative both to its peers and average global growth</w:t>
+            </w:r>
+          </w:p>
+        </w:tc>
+        <w:tc>
+          <w:tcPr>
+            <w:tcW w:type="dxa" w:w="2160"/>
+          </w:tcPr>
+          <w:p>
+            <w:r>
+              <w:t>2026-09-30</w:t>
+            </w:r>
+          </w:p>
+        </w:tc>
+      </w:tr>
+      <w:tr>
+        <w:tc>
+          <w:tcPr>
+            <w:tcW w:type="dxa" w:w="2160"/>
+          </w:tcPr>
+          <w:p>
+            <w:r>
+              <w:t>bleak</w:t>
+            </w:r>
+          </w:p>
+        </w:tc>
+        <w:tc>
+          <w:tcPr>
+            <w:tcW w:type="dxa" w:w="2160"/>
+          </w:tcPr>
+          <w:p>
+            <w:r>
+              <w:t>adj.</w:t>
+            </w:r>
+          </w:p>
+        </w:tc>
+        <w:tc>
+          <w:tcPr>
+            <w:tcW w:type="dxa" w:w="2160"/>
+          </w:tcPr>
+          <w:p>
+            <w:r>
+              <w:t>黯淡的，无望的；荒凉寒冷的（a bleak future / prospect 前景黯淡）；原文 The choice before Brazilians is bleak</w:t>
+            </w:r>
+          </w:p>
+        </w:tc>
+        <w:tc>
+          <w:tcPr>
+            <w:tcW w:type="dxa" w:w="2160"/>
+          </w:tcPr>
+          <w:p>
+            <w:r>
+              <w:t>2026-09-30</w:t>
+            </w:r>
+          </w:p>
+        </w:tc>
+      </w:tr>
+      <w:tr>
+        <w:tc>
+          <w:tcPr>
+            <w:tcW w:type="dxa" w:w="2160"/>
+          </w:tcPr>
+          <w:p>
+            <w:r>
+              <w:t>incumbent</w:t>
+            </w:r>
+          </w:p>
+        </w:tc>
+        <w:tc>
+          <w:tcPr>
+            <w:tcW w:type="dxa" w:w="2160"/>
+          </w:tcPr>
+          <w:p>
+            <w:r>
+              <w:t>n. / adj.</w:t>
+            </w:r>
+          </w:p>
+        </w:tc>
+        <w:tc>
+          <w:tcPr>
+            <w:tcW w:type="dxa" w:w="2160"/>
+          </w:tcPr>
+          <w:p>
+            <w:r>
+              <w:t>n. 在任者，现任者；adj. 现任的（the incumbent president 现任总统）；原文 The incumbent left-wing president, Luiz Inácio Lula da Silva, known as Lula</w:t>
+            </w:r>
+          </w:p>
+        </w:tc>
+        <w:tc>
+          <w:tcPr>
+            <w:tcW w:type="dxa" w:w="2160"/>
+          </w:tcPr>
+          <w:p>
+            <w:r>
+              <w:t>2026-09-30</w:t>
+            </w:r>
+          </w:p>
+        </w:tc>
+      </w:tr>
+      <w:tr>
+        <w:tc>
+          <w:tcPr>
+            <w:tcW w:type="dxa" w:w="2160"/>
+          </w:tcPr>
+          <w:p>
+            <w:r>
+              <w:t>unleash</w:t>
+            </w:r>
+          </w:p>
+        </w:tc>
+        <w:tc>
+          <w:tcPr>
+            <w:tcW w:type="dxa" w:w="2160"/>
+          </w:tcPr>
+          <w:p>
+            <w:r>
+              <w:t>v.</w:t>
+            </w:r>
+          </w:p>
+        </w:tc>
+        <w:tc>
+          <w:tcPr>
+            <w:tcW w:type="dxa" w:w="2160"/>
+          </w:tcPr>
+          <w:p>
+            <w:r>
+              <w:t>释放，发泄，放开（unleash growth / war / a flood of…）；原文 he has done precious little to unleash growth or restrain spending</w:t>
+            </w:r>
+          </w:p>
+        </w:tc>
+        <w:tc>
+          <w:tcPr>
+            <w:tcW w:type="dxa" w:w="2160"/>
+          </w:tcPr>
+          <w:p>
+            <w:r>
+              <w:t>2026-09-30</w:t>
+            </w:r>
+          </w:p>
+        </w:tc>
+      </w:tr>
+      <w:tr>
+        <w:tc>
+          <w:tcPr>
+            <w:tcW w:type="dxa" w:w="2160"/>
+          </w:tcPr>
+          <w:p>
+            <w:r>
+              <w:t>coup</w:t>
+            </w:r>
+          </w:p>
+        </w:tc>
+        <w:tc>
+          <w:tcPr>
+            <w:tcW w:type="dxa" w:w="2160"/>
+          </w:tcPr>
+          <w:p>
+            <w:r>
+              <w:t>n.</w:t>
+            </w:r>
+          </w:p>
+        </w:tc>
+        <w:tc>
+          <w:tcPr>
+            <w:tcW w:type="dxa" w:w="2160"/>
+          </w:tcPr>
+          <w:p>
+            <w:r>
+              <w:t>政变（plot / stage a coup 策划/发动政变；coup d'état；读 /kuː/）；原文 handed a 27-year sentence for plotting a coup—including a plan to assassinate Lula</w:t>
+            </w:r>
+          </w:p>
+        </w:tc>
+        <w:tc>
+          <w:tcPr>
+            <w:tcW w:type="dxa" w:w="2160"/>
+          </w:tcPr>
+          <w:p>
+            <w:r>
+              <w:t>2026-09-30</w:t>
+            </w:r>
+          </w:p>
+        </w:tc>
+      </w:tr>
+      <w:tr>
+        <w:tc>
+          <w:tcPr>
+            <w:tcW w:type="dxa" w:w="2160"/>
+          </w:tcPr>
+          <w:p>
+            <w:r>
+              <w:t>alleged</w:t>
+            </w:r>
+          </w:p>
+        </w:tc>
+        <w:tc>
+          <w:tcPr>
+            <w:tcW w:type="dxa" w:w="2160"/>
+          </w:tcPr>
+          <w:p>
+            <w:r>
+              <w:t>adj.</w:t>
+            </w:r>
+          </w:p>
+        </w:tc>
+        <w:tc>
+          <w:tcPr>
+            <w:tcW w:type="dxa" w:w="2160"/>
+          </w:tcPr>
+          <w:p>
+            <w:r>
+              <w:t>涉嫌的，被指称的（alleged ties 涉嫌关联；the alleged criminal）；动词 allege（无证据地）声称；原文 He has been investigated for alleged ties to violent criminals</w:t>
+            </w:r>
+          </w:p>
+        </w:tc>
+        <w:tc>
+          <w:tcPr>
+            <w:tcW w:type="dxa" w:w="2160"/>
+          </w:tcPr>
+          <w:p>
+            <w:r>
+              <w:t>2026-09-30</w:t>
+            </w:r>
+          </w:p>
+        </w:tc>
+      </w:tr>
+      <w:tr>
+        <w:tc>
+          <w:tcPr>
+            <w:tcW w:type="dxa" w:w="2160"/>
+          </w:tcPr>
+          <w:p>
+            <w:r>
+              <w:t>entrenched</w:t>
+            </w:r>
+          </w:p>
+        </w:tc>
+        <w:tc>
+          <w:tcPr>
+            <w:tcW w:type="dxa" w:w="2160"/>
+          </w:tcPr>
+          <w:p>
+            <w:r>
+              <w:t>adj.</w:t>
+            </w:r>
+          </w:p>
+        </w:tc>
+        <w:tc>
+          <w:tcPr>
+            <w:tcW w:type="dxa" w:w="2160"/>
+          </w:tcPr>
+          <w:p>
+            <w:r>
+              <w:t>根深蒂固的，固化的（entrenched corruption / interests / attitudes；动词 entrench）；原文 Brazil's two biggest problems: entrenched corruption and the relentless expansion of public spending</w:t>
+            </w:r>
+          </w:p>
+        </w:tc>
+        <w:tc>
+          <w:tcPr>
+            <w:tcW w:type="dxa" w:w="2160"/>
+          </w:tcPr>
+          <w:p>
+            <w:r>
+              <w:t>2026-09-30</w:t>
+            </w:r>
+          </w:p>
+        </w:tc>
+      </w:tr>
+      <w:tr>
+        <w:tc>
+          <w:tcPr>
+            <w:tcW w:type="dxa" w:w="2160"/>
+          </w:tcPr>
+          <w:p>
+            <w:r>
+              <w:t>relentless</w:t>
+            </w:r>
+          </w:p>
+        </w:tc>
+        <w:tc>
+          <w:tcPr>
+            <w:tcW w:type="dxa" w:w="2160"/>
+          </w:tcPr>
+          <w:p>
+            <w:r>
+              <w:t>adj.</w:t>
+            </w:r>
+          </w:p>
+        </w:tc>
+        <w:tc>
+          <w:tcPr>
+            <w:tcW w:type="dxa" w:w="2160"/>
+          </w:tcPr>
+          <w:p>
+            <w:r>
+              <w:t>不间断的，势头不减的，不留情的（relentless expansion / pressure / pursuit）；原文 the relentless expansion of public spending</w:t>
+            </w:r>
+          </w:p>
+        </w:tc>
+        <w:tc>
+          <w:tcPr>
+            <w:tcW w:type="dxa" w:w="2160"/>
+          </w:tcPr>
+          <w:p>
+            <w:r>
+              <w:t>2026-09-30</w:t>
+            </w:r>
+          </w:p>
+        </w:tc>
+      </w:tr>
+      <w:tr>
+        <w:tc>
+          <w:tcPr>
+            <w:tcW w:type="dxa" w:w="2160"/>
+          </w:tcPr>
+          <w:p>
+            <w:r>
+              <w:t>spiral</w:t>
+            </w:r>
+          </w:p>
+        </w:tc>
+        <w:tc>
+          <w:tcPr>
+            <w:tcW w:type="dxa" w:w="2160"/>
+          </w:tcPr>
+          <w:p>
+            <w:r>
+              <w:t>v. / n.</w:t>
+            </w:r>
+          </w:p>
+        </w:tc>
+        <w:tc>
+          <w:tcPr>
+            <w:tcW w:type="dxa" w:w="2160"/>
+          </w:tcPr>
+          <w:p>
+            <w:r>
+              <w:t>螺旋式上升/下降；（代价）急剧恶化（a debt spiral 债务螺旋；spiral out of control 失控）；原文 the risk of a debt-interest spiral will keep borrowing costs high</w:t>
+            </w:r>
+          </w:p>
+        </w:tc>
+        <w:tc>
+          <w:tcPr>
+            <w:tcW w:type="dxa" w:w="2160"/>
+          </w:tcPr>
+          <w:p>
+            <w:r>
+              <w:t>2026-09-30</w:t>
+            </w:r>
+          </w:p>
         </w:tc>
       </w:tr>
     </w:tbl>

</xml_diff>

<commit_message>
update: 2026-09-22~10-02 各期 + 53 个生词
</commit_message>
<xml_diff>
--- a/生词本/单词本.docx
+++ b/生词本/单词本.docx
@@ -5178,6 +5178,2232 @@
           <w:p>
             <w:r>
               <w:t>2026-09-30</w:t>
+            </w:r>
+          </w:p>
+        </w:tc>
+      </w:tr>
+      <w:tr>
+        <w:tc>
+          <w:tcPr>
+            <w:tcW w:type="dxa" w:w="2160"/>
+          </w:tcPr>
+          <w:p>
+            <w:r>
+              <w:t>collusion</w:t>
+            </w:r>
+          </w:p>
+        </w:tc>
+        <w:tc>
+          <w:tcPr>
+            <w:tcW w:type="dxa" w:w="2160"/>
+          </w:tcPr>
+          <w:p>
+            <w:r>
+              <w:t>n.</w:t>
+            </w:r>
+          </w:p>
+        </w:tc>
+        <w:tc>
+          <w:tcPr>
+            <w:tcW w:type="dxa" w:w="2160"/>
+          </w:tcPr>
+          <w:p>
+            <w:r>
+              <w:t>勾结，串通（in collusion with 与…勾结；动词 collude）；原文 a public inquiry has revealed staggering collusion between gangs, officials and senior police</w:t>
+            </w:r>
+          </w:p>
+        </w:tc>
+        <w:tc>
+          <w:tcPr>
+            <w:tcW w:type="dxa" w:w="2160"/>
+          </w:tcPr>
+          <w:p>
+            <w:r>
+              <w:t>2026-10-02</w:t>
+            </w:r>
+          </w:p>
+        </w:tc>
+      </w:tr>
+      <w:tr>
+        <w:tc>
+          <w:tcPr>
+            <w:tcW w:type="dxa" w:w="2160"/>
+          </w:tcPr>
+          <w:p>
+            <w:r>
+              <w:t>trafficking</w:t>
+            </w:r>
+          </w:p>
+        </w:tc>
+        <w:tc>
+          <w:tcPr>
+            <w:tcW w:type="dxa" w:w="2160"/>
+          </w:tcPr>
+          <w:p>
+            <w:r>
+              <w:t>n.</w:t>
+            </w:r>
+          </w:p>
+        </w:tc>
+        <w:tc>
+          <w:tcPr>
+            <w:tcW w:type="dxa" w:w="2160"/>
+          </w:tcPr>
+          <w:p>
+            <w:r>
+              <w:t>非法贩运，非法交易（drug / human / wildlife trafficking 贩毒/人口/野生动物贩运；动词 traffic，注意 -ck- 双写）；原文 It has also been a hub for trafficking drugs, people and endangered wildlife</w:t>
+            </w:r>
+          </w:p>
+        </w:tc>
+        <w:tc>
+          <w:tcPr>
+            <w:tcW w:type="dxa" w:w="2160"/>
+          </w:tcPr>
+          <w:p>
+            <w:r>
+              <w:t>2026-10-02</w:t>
+            </w:r>
+          </w:p>
+        </w:tc>
+      </w:tr>
+      <w:tr>
+        <w:tc>
+          <w:tcPr>
+            <w:tcW w:type="dxa" w:w="2160"/>
+          </w:tcPr>
+          <w:p>
+            <w:r>
+              <w:t>extortion</w:t>
+            </w:r>
+          </w:p>
+        </w:tc>
+        <w:tc>
+          <w:tcPr>
+            <w:tcW w:type="dxa" w:w="2160"/>
+          </w:tcPr>
+          <w:p>
+            <w:r>
+              <w:t>n.</w:t>
+            </w:r>
+          </w:p>
+        </w:tc>
+        <w:tc>
+          <w:tcPr>
+            <w:tcW w:type="dxa" w:w="2160"/>
+          </w:tcPr>
+          <w:p>
+            <w:r>
+              <w:t>敲诈，勒索（extortion mafias 勒索团伙；动词 extort）；原文 the rise of extortion mafias, which demand cash for not sabotaging building projects</w:t>
+            </w:r>
+          </w:p>
+        </w:tc>
+        <w:tc>
+          <w:tcPr>
+            <w:tcW w:type="dxa" w:w="2160"/>
+          </w:tcPr>
+          <w:p>
+            <w:r>
+              <w:t>2026-10-02</w:t>
+            </w:r>
+          </w:p>
+        </w:tc>
+      </w:tr>
+      <w:tr>
+        <w:tc>
+          <w:tcPr>
+            <w:tcW w:type="dxa" w:w="2160"/>
+          </w:tcPr>
+          <w:p>
+            <w:r>
+              <w:t>sabotage</w:t>
+            </w:r>
+          </w:p>
+        </w:tc>
+        <w:tc>
+          <w:tcPr>
+            <w:tcW w:type="dxa" w:w="2160"/>
+          </w:tcPr>
+          <w:p>
+            <w:r>
+              <w:t>v. / n.</w:t>
+            </w:r>
+          </w:p>
+        </w:tc>
+        <w:tc>
+          <w:tcPr>
+            <w:tcW w:type="dxa" w:w="2160"/>
+          </w:tcPr>
+          <w:p>
+            <w:r>
+              <w:t>蓄意破坏，暗中捣乱（sabotage a project / talks）；原文 demand cash for not sabotaging building projects, setting fire to buses or murdering teachers</w:t>
+            </w:r>
+          </w:p>
+        </w:tc>
+        <w:tc>
+          <w:tcPr>
+            <w:tcW w:type="dxa" w:w="2160"/>
+          </w:tcPr>
+          <w:p>
+            <w:r>
+              <w:t>2026-10-02</w:t>
+            </w:r>
+          </w:p>
+        </w:tc>
+      </w:tr>
+      <w:tr>
+        <w:tc>
+          <w:tcPr>
+            <w:tcW w:type="dxa" w:w="2160"/>
+          </w:tcPr>
+          <w:p>
+            <w:r>
+              <w:t>infiltrate</w:t>
+            </w:r>
+          </w:p>
+        </w:tc>
+        <w:tc>
+          <w:tcPr>
+            <w:tcW w:type="dxa" w:w="2160"/>
+          </w:tcPr>
+          <w:p>
+            <w:r>
+              <w:t>v.</w:t>
+            </w:r>
+          </w:p>
+        </w:tc>
+        <w:tc>
+          <w:tcPr>
+            <w:tcW w:type="dxa" w:w="2160"/>
+          </w:tcPr>
+          <w:p>
+            <w:r>
+              <w:t>渗透，潜入（组织、机构）（infiltrate the state / an agency；名词 infiltration）；原文 gangs have infiltrated the state, like the bloodsucking ticks that give bush hikers a fever</w:t>
+            </w:r>
+          </w:p>
+        </w:tc>
+        <w:tc>
+          <w:tcPr>
+            <w:tcW w:type="dxa" w:w="2160"/>
+          </w:tcPr>
+          <w:p>
+            <w:r>
+              <w:t>2026-10-02</w:t>
+            </w:r>
+          </w:p>
+        </w:tc>
+      </w:tr>
+      <w:tr>
+        <w:tc>
+          <w:tcPr>
+            <w:tcW w:type="dxa" w:w="2160"/>
+          </w:tcPr>
+          <w:p>
+            <w:r>
+              <w:t>tainted</w:t>
+            </w:r>
+          </w:p>
+        </w:tc>
+        <w:tc>
+          <w:tcPr>
+            <w:tcW w:type="dxa" w:w="2160"/>
+          </w:tcPr>
+          <w:p>
+            <w:r>
+              <w:t>adj.</w:t>
+            </w:r>
+          </w:p>
+        </w:tc>
+        <w:tc>
+          <w:tcPr>
+            <w:tcW w:type="dxa" w:w="2160"/>
+          </w:tcPr>
+          <w:p>
+            <w:r>
+              <w:t>受污染的，有污点的，腐败的（tainted prosecutors / tainted money；动词 taint）；原文 That means sacking tainted prosecutors and senior cops</w:t>
+            </w:r>
+          </w:p>
+        </w:tc>
+        <w:tc>
+          <w:tcPr>
+            <w:tcW w:type="dxa" w:w="2160"/>
+          </w:tcPr>
+          <w:p>
+            <w:r>
+              <w:t>2026-10-02</w:t>
+            </w:r>
+          </w:p>
+        </w:tc>
+      </w:tr>
+      <w:tr>
+        <w:tc>
+          <w:tcPr>
+            <w:tcW w:type="dxa" w:w="2160"/>
+          </w:tcPr>
+          <w:p>
+            <w:r>
+              <w:t>purge</w:t>
+            </w:r>
+          </w:p>
+        </w:tc>
+        <w:tc>
+          <w:tcPr>
+            <w:tcW w:type="dxa" w:w="2160"/>
+          </w:tcPr>
+          <w:p>
+            <w:r>
+              <w:t>n. / v.</w:t>
+            </w:r>
+          </w:p>
+        </w:tc>
+        <w:tc>
+          <w:tcPr>
+            <w:tcW w:type="dxa" w:w="2160"/>
+          </w:tcPr>
+          <w:p>
+            <w:r>
+              <w:t>（政治）清洗，整肃（a purge of…；动词 purge sb from sth；本义“泻药、通便”）；原文 That purge should gather pace</w:t>
+            </w:r>
+          </w:p>
+        </w:tc>
+        <w:tc>
+          <w:tcPr>
+            <w:tcW w:type="dxa" w:w="2160"/>
+          </w:tcPr>
+          <w:p>
+            <w:r>
+              <w:t>2026-10-02</w:t>
+            </w:r>
+          </w:p>
+        </w:tc>
+      </w:tr>
+      <w:tr>
+        <w:tc>
+          <w:tcPr>
+            <w:tcW w:type="dxa" w:w="2160"/>
+          </w:tcPr>
+          <w:p>
+            <w:r>
+              <w:t>kickback</w:t>
+            </w:r>
+          </w:p>
+        </w:tc>
+        <w:tc>
+          <w:tcPr>
+            <w:tcW w:type="dxa" w:w="2160"/>
+          </w:tcPr>
+          <w:p>
+            <w:r>
+              <w:t>n.</w:t>
+            </w:r>
+          </w:p>
+        </w:tc>
+        <w:tc>
+          <w:tcPr>
+            <w:tcW w:type="dxa" w:w="2160"/>
+          </w:tcPr>
+          <w:p>
+            <w:r>
+              <w:t>回扣，贿赂金（pocket / take kickbacks 收回扣；本义“反冲、回弹”）；原文 steering dodgy public contracts their way, pocketing kickbacks and borrowing their muscle</w:t>
+            </w:r>
+          </w:p>
+        </w:tc>
+        <w:tc>
+          <w:tcPr>
+            <w:tcW w:type="dxa" w:w="2160"/>
+          </w:tcPr>
+          <w:p>
+            <w:r>
+              <w:t>2026-10-02</w:t>
+            </w:r>
+          </w:p>
+        </w:tc>
+      </w:tr>
+      <w:tr>
+        <w:tc>
+          <w:tcPr>
+            <w:tcW w:type="dxa" w:w="2160"/>
+          </w:tcPr>
+          <w:p>
+            <w:r>
+              <w:t>calamity</w:t>
+            </w:r>
+          </w:p>
+        </w:tc>
+        <w:tc>
+          <w:tcPr>
+            <w:tcW w:type="dxa" w:w="2160"/>
+          </w:tcPr>
+          <w:p>
+            <w:r>
+              <w:t>n.</w:t>
+            </w:r>
+          </w:p>
+        </w:tc>
+        <w:tc>
+          <w:tcPr>
+            <w:tcW w:type="dxa" w:w="2160"/>
+          </w:tcPr>
+          <w:p>
+            <w:r>
+              <w:t>灾难，祸患（calamity beckons 大祸临头；比 disaster 更书面）；原文 If he fails, calamity beckons</w:t>
+            </w:r>
+          </w:p>
+        </w:tc>
+        <w:tc>
+          <w:tcPr>
+            <w:tcW w:type="dxa" w:w="2160"/>
+          </w:tcPr>
+          <w:p>
+            <w:r>
+              <w:t>2026-10-02</w:t>
+            </w:r>
+          </w:p>
+        </w:tc>
+      </w:tr>
+      <w:tr>
+        <w:tc>
+          <w:tcPr>
+            <w:tcW w:type="dxa" w:w="2160"/>
+          </w:tcPr>
+          <w:p>
+            <w:r>
+              <w:t>autocrat</w:t>
+            </w:r>
+          </w:p>
+        </w:tc>
+        <w:tc>
+          <w:tcPr>
+            <w:tcW w:type="dxa" w:w="2160"/>
+          </w:tcPr>
+          <w:p>
+            <w:r>
+              <w:t>n.</w:t>
+            </w:r>
+          </w:p>
+        </w:tc>
+        <w:tc>
+          <w:tcPr>
+            <w:tcW w:type="dxa" w:w="2160"/>
+          </w:tcPr>
+          <w:p>
+            <w:r>
+              <w:t>独裁者，专制君主（autocratic adj. 专制的；auto-（自己）+ -crat（统治者））；原文 Nayib Bukele, the gangbusting autocrat of El Salvador</w:t>
+            </w:r>
+          </w:p>
+        </w:tc>
+        <w:tc>
+          <w:tcPr>
+            <w:tcW w:type="dxa" w:w="2160"/>
+          </w:tcPr>
+          <w:p>
+            <w:r>
+              <w:t>2026-10-02</w:t>
+            </w:r>
+          </w:p>
+        </w:tc>
+      </w:tr>
+      <w:tr>
+        <w:tc>
+          <w:tcPr>
+            <w:tcW w:type="dxa" w:w="2160"/>
+          </w:tcPr>
+          <w:p>
+            <w:r>
+              <w:t>plurality</w:t>
+            </w:r>
+          </w:p>
+        </w:tc>
+        <w:tc>
+          <w:tcPr>
+            <w:tcW w:type="dxa" w:w="2160"/>
+          </w:tcPr>
+          <w:p>
+            <w:r>
+              <w:t>n.</w:t>
+            </w:r>
+          </w:p>
+        </w:tc>
+        <w:tc>
+          <w:tcPr>
+            <w:tcW w:type="dxa" w:w="2160"/>
+          </w:tcPr>
+          <w:p>
+            <w:r>
+              <w:t>相对多数（得票最多但未过半；区别 majority 绝对多数/过半）；原文 the AfD won a plurality of votes: nearly forty-four per cent</w:t>
+            </w:r>
+          </w:p>
+        </w:tc>
+        <w:tc>
+          <w:tcPr>
+            <w:tcW w:type="dxa" w:w="2160"/>
+          </w:tcPr>
+          <w:p>
+            <w:r>
+              <w:t>2026-10-02</w:t>
+            </w:r>
+          </w:p>
+        </w:tc>
+      </w:tr>
+      <w:tr>
+        <w:tc>
+          <w:tcPr>
+            <w:tcW w:type="dxa" w:w="2160"/>
+          </w:tcPr>
+          <w:p>
+            <w:r>
+              <w:t>enshrine</w:t>
+            </w:r>
+          </w:p>
+        </w:tc>
+        <w:tc>
+          <w:tcPr>
+            <w:tcW w:type="dxa" w:w="2160"/>
+          </w:tcPr>
+          <w:p>
+            <w:r>
+              <w:t>v.</w:t>
+            </w:r>
+          </w:p>
+        </w:tc>
+        <w:tc>
+          <w:tcPr>
+            <w:tcW w:type="dxa" w:w="2160"/>
+          </w:tcPr>
+          <w:p>
+            <w:r>
+              <w:t>把…庄严写入（宪法/法律），奉为神圣；原文 Basic Law… enshrined a set of principles known as wehrhafte Demokratie, or militant democracy</w:t>
+            </w:r>
+          </w:p>
+        </w:tc>
+        <w:tc>
+          <w:tcPr>
+            <w:tcW w:type="dxa" w:w="2160"/>
+          </w:tcPr>
+          <w:p>
+            <w:r>
+              <w:t>2026-10-02</w:t>
+            </w:r>
+          </w:p>
+        </w:tc>
+      </w:tr>
+      <w:tr>
+        <w:tc>
+          <w:tcPr>
+            <w:tcW w:type="dxa" w:w="2160"/>
+          </w:tcPr>
+          <w:p>
+            <w:r>
+              <w:t>deportation</w:t>
+            </w:r>
+          </w:p>
+        </w:tc>
+        <w:tc>
+          <w:tcPr>
+            <w:tcW w:type="dxa" w:w="2160"/>
+          </w:tcPr>
+          <w:p>
+            <w:r>
+              <w:t>n.</w:t>
+            </w:r>
+          </w:p>
+        </w:tc>
+        <w:tc>
+          <w:tcPr>
+            <w:tcW w:type="dxa" w:w="2160"/>
+          </w:tcPr>
+          <w:p>
+            <w:r>
+              <w:t>遣返，驱逐出境（mass deportations 大规模驱逐；动词 deport）；原文 senior AfD figures attended a secret conference to discuss mass deportations of immigrants</w:t>
+            </w:r>
+          </w:p>
+        </w:tc>
+        <w:tc>
+          <w:tcPr>
+            <w:tcW w:type="dxa" w:w="2160"/>
+          </w:tcPr>
+          <w:p>
+            <w:r>
+              <w:t>2026-10-02</w:t>
+            </w:r>
+          </w:p>
+        </w:tc>
+      </w:tr>
+      <w:tr>
+        <w:tc>
+          <w:tcPr>
+            <w:tcW w:type="dxa" w:w="2160"/>
+          </w:tcPr>
+          <w:p>
+            <w:r>
+              <w:t>palatable</w:t>
+            </w:r>
+          </w:p>
+        </w:tc>
+        <w:tc>
+          <w:tcPr>
+            <w:tcW w:type="dxa" w:w="2160"/>
+          </w:tcPr>
+          <w:p>
+            <w:r>
+              <w:t>adj.</w:t>
+            </w:r>
+          </w:p>
+        </w:tc>
+        <w:tc>
+          <w:tcPr>
+            <w:tcW w:type="dxa" w:w="2160"/>
+          </w:tcPr>
+          <w:p>
+            <w:r>
+              <w:t>讨人喜欢的，可接受的（make sth more palatable；本义“好吃的、可口”）；原文 other right-wing parties have drifted toward the center to make their positions more palatable</w:t>
+            </w:r>
+          </w:p>
+        </w:tc>
+        <w:tc>
+          <w:tcPr>
+            <w:tcW w:type="dxa" w:w="2160"/>
+          </w:tcPr>
+          <w:p>
+            <w:r>
+              <w:t>2026-10-02</w:t>
+            </w:r>
+          </w:p>
+        </w:tc>
+      </w:tr>
+      <w:tr>
+        <w:tc>
+          <w:tcPr>
+            <w:tcW w:type="dxa" w:w="2160"/>
+          </w:tcPr>
+          <w:p>
+            <w:r>
+              <w:t>articulate</w:t>
+            </w:r>
+          </w:p>
+        </w:tc>
+        <w:tc>
+          <w:tcPr>
+            <w:tcW w:type="dxa" w:w="2160"/>
+          </w:tcPr>
+          <w:p>
+            <w:r>
+              <w:t>v. / adj.</w:t>
+            </w:r>
+          </w:p>
+        </w:tc>
+        <w:tc>
+          <w:tcPr>
+            <w:tcW w:type="dxa" w:w="2160"/>
+          </w:tcPr>
+          <w:p>
+            <w:r>
+              <w:t>v. 清晰地表达，阐明（articulate a vision / program）；adj. 口齿清楚的；原文 the Brandmauer allowed establishment parties to focus on defense rather than articulating a program that will win over voters</w:t>
+            </w:r>
+          </w:p>
+        </w:tc>
+        <w:tc>
+          <w:tcPr>
+            <w:tcW w:type="dxa" w:w="2160"/>
+          </w:tcPr>
+          <w:p>
+            <w:r>
+              <w:t>2026-10-02</w:t>
+            </w:r>
+          </w:p>
+        </w:tc>
+      </w:tr>
+      <w:tr>
+        <w:tc>
+          <w:tcPr>
+            <w:tcW w:type="dxa" w:w="2160"/>
+          </w:tcPr>
+          <w:p>
+            <w:r>
+              <w:t>stoke</w:t>
+            </w:r>
+          </w:p>
+        </w:tc>
+        <w:tc>
+          <w:tcPr>
+            <w:tcW w:type="dxa" w:w="2160"/>
+          </w:tcPr>
+          <w:p>
+            <w:r>
+              <w:t>v.</w:t>
+            </w:r>
+          </w:p>
+        </w:tc>
+        <w:tc>
+          <w:tcPr>
+            <w:tcW w:type="dxa" w:w="2160"/>
+          </w:tcPr>
+          <w:p>
+            <w:r>
+              <w:t>煽动，激起；添柴加火（stoke fears / inflation / anger）；原文 Germany is changing…and, in a sizable part of the population, that is stoking a desire for radical solutions</w:t>
+            </w:r>
+          </w:p>
+        </w:tc>
+        <w:tc>
+          <w:tcPr>
+            <w:tcW w:type="dxa" w:w="2160"/>
+          </w:tcPr>
+          <w:p>
+            <w:r>
+              <w:t>2026-10-02</w:t>
+            </w:r>
+          </w:p>
+        </w:tc>
+      </w:tr>
+      <w:tr>
+        <w:tc>
+          <w:tcPr>
+            <w:tcW w:type="dxa" w:w="2160"/>
+          </w:tcPr>
+          <w:p>
+            <w:r>
+              <w:t>malaise</w:t>
+            </w:r>
+          </w:p>
+        </w:tc>
+        <w:tc>
+          <w:tcPr>
+            <w:tcW w:type="dxa" w:w="2160"/>
+          </w:tcPr>
+          <w:p>
+            <w:r>
+              <w:t>n.</w:t>
+            </w:r>
+          </w:p>
+        </w:tc>
+        <w:tc>
+          <w:tcPr>
+            <w:tcW w:type="dxa" w:w="2160"/>
+          </w:tcPr>
+          <w:p>
+            <w:r>
+              <w:t>萎靡，不适；（社会的）普遍病态（economic malaise 经济萎靡；源自法语“不安”）；原文 That sort of malaise may lead to support for the AfD</w:t>
+            </w:r>
+          </w:p>
+        </w:tc>
+        <w:tc>
+          <w:tcPr>
+            <w:tcW w:type="dxa" w:w="2160"/>
+          </w:tcPr>
+          <w:p>
+            <w:r>
+              <w:t>2026-10-02</w:t>
+            </w:r>
+          </w:p>
+        </w:tc>
+      </w:tr>
+      <w:tr>
+        <w:tc>
+          <w:tcPr>
+            <w:tcW w:type="dxa" w:w="2160"/>
+          </w:tcPr>
+          <w:p>
+            <w:r>
+              <w:t>layoff</w:t>
+            </w:r>
+          </w:p>
+        </w:tc>
+        <w:tc>
+          <w:tcPr>
+            <w:tcW w:type="dxa" w:w="2160"/>
+          </w:tcPr>
+          <w:p>
+            <w:r>
+              <w:t>n.</w:t>
+            </w:r>
+          </w:p>
+        </w:tc>
+        <w:tc>
+          <w:tcPr>
+            <w:tcW w:type="dxa" w:w="2160"/>
+          </w:tcPr>
+          <w:p>
+            <w:r>
+              <w:t>裁员，解雇（phased layoffs 分阶段裁员；动词 lay off）；原文 plans for fifty thousand additional phased layoffs and the end of production at four plants</w:t>
+            </w:r>
+          </w:p>
+        </w:tc>
+        <w:tc>
+          <w:tcPr>
+            <w:tcW w:type="dxa" w:w="2160"/>
+          </w:tcPr>
+          <w:p>
+            <w:r>
+              <w:t>2026-10-02</w:t>
+            </w:r>
+          </w:p>
+        </w:tc>
+      </w:tr>
+      <w:tr>
+        <w:tc>
+          <w:tcPr>
+            <w:tcW w:type="dxa" w:w="2160"/>
+          </w:tcPr>
+          <w:p>
+            <w:r>
+              <w:t>stopgap</w:t>
+            </w:r>
+          </w:p>
+        </w:tc>
+        <w:tc>
+          <w:tcPr>
+            <w:tcW w:type="dxa" w:w="2160"/>
+          </w:tcPr>
+          <w:p>
+            <w:r>
+              <w:t>n. / adj.</w:t>
+            </w:r>
+          </w:p>
+        </w:tc>
+        <w:tc>
+          <w:tcPr>
+            <w:tcW w:type="dxa" w:w="2160"/>
+          </w:tcPr>
+          <w:p>
+            <w:r>
+              <w:t>权宜之计（的）（a stopgap measure / a stopgap solution；堵缺口之物）；原文 None of these stopgap measures deal with the real problem</w:t>
+            </w:r>
+          </w:p>
+        </w:tc>
+        <w:tc>
+          <w:tcPr>
+            <w:tcW w:type="dxa" w:w="2160"/>
+          </w:tcPr>
+          <w:p>
+            <w:r>
+              <w:t>2026-10-02</w:t>
+            </w:r>
+          </w:p>
+        </w:tc>
+      </w:tr>
+      <w:tr>
+        <w:tc>
+          <w:tcPr>
+            <w:tcW w:type="dxa" w:w="2160"/>
+          </w:tcPr>
+          <w:p>
+            <w:r>
+              <w:t>stasis</w:t>
+            </w:r>
+          </w:p>
+        </w:tc>
+        <w:tc>
+          <w:tcPr>
+            <w:tcW w:type="dxa" w:w="2160"/>
+          </w:tcPr>
+          <w:p>
+            <w:r>
+              <w:t>n.</w:t>
+            </w:r>
+          </w:p>
+        </w:tc>
+        <w:tc>
+          <w:tcPr>
+            <w:tcW w:type="dxa" w:w="2160"/>
+          </w:tcPr>
+          <w:p>
+            <w:r>
+              <w:t>停滞，僵局（源自希腊语“站立不动”；political stasis 政治僵局）；原文 Perhaps more likely is a political stasis, in which neither the AfD nor the forces opposed to it take charge outright</w:t>
+            </w:r>
+          </w:p>
+        </w:tc>
+        <w:tc>
+          <w:tcPr>
+            <w:tcW w:type="dxa" w:w="2160"/>
+          </w:tcPr>
+          <w:p>
+            <w:r>
+              <w:t>2026-10-02</w:t>
+            </w:r>
+          </w:p>
+        </w:tc>
+      </w:tr>
+      <w:tr>
+        <w:tc>
+          <w:tcPr>
+            <w:tcW w:type="dxa" w:w="2160"/>
+          </w:tcPr>
+          <w:p>
+            <w:r>
+              <w:t>retroactive</w:t>
+            </w:r>
+          </w:p>
+        </w:tc>
+        <w:tc>
+          <w:tcPr>
+            <w:tcW w:type="dxa" w:w="2160"/>
+          </w:tcPr>
+          <w:p>
+            <w:r>
+              <w:t>adj.</w:t>
+            </w:r>
+          </w:p>
+        </w:tc>
+        <w:tc>
+          <w:tcPr>
+            <w:tcW w:type="dxa" w:w="2160"/>
+          </w:tcPr>
+          <w:p>
+            <w:r>
+              <w:t>溯及既往的，有追溯效力的（be made retroactive；retro-（向后）+ active；反义 prospective 面向未来的）；原文 Any new rules could be made retroactive, forcing Reform to return most of the dosh</w:t>
+            </w:r>
+          </w:p>
+        </w:tc>
+        <w:tc>
+          <w:tcPr>
+            <w:tcW w:type="dxa" w:w="2160"/>
+          </w:tcPr>
+          <w:p>
+            <w:r>
+              <w:t>2026-10-02</w:t>
+            </w:r>
+          </w:p>
+        </w:tc>
+      </w:tr>
+      <w:tr>
+        <w:tc>
+          <w:tcPr>
+            <w:tcW w:type="dxa" w:w="2160"/>
+          </w:tcPr>
+          <w:p>
+            <w:r>
+              <w:t>hold water</w:t>
+            </w:r>
+          </w:p>
+        </w:tc>
+        <w:tc>
+          <w:tcPr>
+            <w:tcW w:type="dxa" w:w="2160"/>
+          </w:tcPr>
+          <w:p>
+            <w:r>
+              <w:t>phr.</w:t>
+            </w:r>
+          </w:p>
+        </w:tc>
+        <w:tc>
+          <w:tcPr>
+            <w:tcW w:type="dxa" w:w="2160"/>
+          </w:tcPr>
+          <w:p>
+            <w:r>
+              <w:t>（论点）站得住脚，经得起推敲（多用于否定：that excuse doesn't hold water）；原文 The worriers make three intertwined arguments. Only one of these claims holds water</w:t>
+            </w:r>
+          </w:p>
+        </w:tc>
+        <w:tc>
+          <w:tcPr>
+            <w:tcW w:type="dxa" w:w="2160"/>
+          </w:tcPr>
+          <w:p>
+            <w:r>
+              <w:t>2026-10-02</w:t>
+            </w:r>
+          </w:p>
+        </w:tc>
+      </w:tr>
+      <w:tr>
+        <w:tc>
+          <w:tcPr>
+            <w:tcW w:type="dxa" w:w="2160"/>
+          </w:tcPr>
+          <w:p>
+            <w:r>
+              <w:t>windfall</w:t>
+            </w:r>
+          </w:p>
+        </w:tc>
+        <w:tc>
+          <w:tcPr>
+            <w:tcW w:type="dxa" w:w="2160"/>
+          </w:tcPr>
+          <w:p>
+            <w:r>
+              <w:t>n.</w:t>
+            </w:r>
+          </w:p>
+        </w:tc>
+        <w:tc>
+          <w:tcPr>
+            <w:tcW w:type="dxa" w:w="2160"/>
+          </w:tcPr>
+          <w:p>
+            <w:r>
+              <w:t>意外之财，飞来横财（windfall profits / windfall tax 意外利润/暴利税；原义“被风吹落的果子”）；原文 the windfall could grow poisonous as factions already at war within the party struggle for a share of the spoils</w:t>
+            </w:r>
+          </w:p>
+        </w:tc>
+        <w:tc>
+          <w:tcPr>
+            <w:tcW w:type="dxa" w:w="2160"/>
+          </w:tcPr>
+          <w:p>
+            <w:r>
+              <w:t>2026-10-02</w:t>
+            </w:r>
+          </w:p>
+        </w:tc>
+      </w:tr>
+      <w:tr>
+        <w:tc>
+          <w:tcPr>
+            <w:tcW w:type="dxa" w:w="2160"/>
+          </w:tcPr>
+          <w:p>
+            <w:r>
+              <w:t>spoils</w:t>
+            </w:r>
+          </w:p>
+        </w:tc>
+        <w:tc>
+          <w:tcPr>
+            <w:tcW w:type="dxa" w:w="2160"/>
+          </w:tcPr>
+          <w:p>
+            <w:r>
+              <w:t>n. [pl.]</w:t>
+            </w:r>
+          </w:p>
+        </w:tc>
+        <w:tc>
+          <w:tcPr>
+            <w:tcW w:type="dxa" w:w="2160"/>
+          </w:tcPr>
+          <w:p>
+            <w:r>
+              <w:t>（复数）战利品，赃物；（政治上）胜利果实、分肥（the spoils of victory；spoils system 分赃制；注意与动词 spoil“宠坏、破坏”区分）；原文 factions struggle for a share of the spoils</w:t>
+            </w:r>
+          </w:p>
+        </w:tc>
+        <w:tc>
+          <w:tcPr>
+            <w:tcW w:type="dxa" w:w="2160"/>
+          </w:tcPr>
+          <w:p>
+            <w:r>
+              <w:t>2026-10-02</w:t>
+            </w:r>
+          </w:p>
+        </w:tc>
+      </w:tr>
+      <w:tr>
+        <w:tc>
+          <w:tcPr>
+            <w:tcW w:type="dxa" w:w="2160"/>
+          </w:tcPr>
+          <w:p>
+            <w:r>
+              <w:t>infusion</w:t>
+            </w:r>
+          </w:p>
+        </w:tc>
+        <w:tc>
+          <w:tcPr>
+            <w:tcW w:type="dxa" w:w="2160"/>
+          </w:tcPr>
+          <w:p>
+            <w:r>
+              <w:t>n.</w:t>
+            </w:r>
+          </w:p>
+        </w:tc>
+        <w:tc>
+          <w:tcPr>
+            <w:tcW w:type="dxa" w:w="2160"/>
+          </w:tcPr>
+          <w:p>
+            <w:r>
+              <w:t>注入，输入（a cash infusion 资金注入；动词 infuse 注入，泡（茶））；原文 Reform boasts that it will use its new infusion of cash to double the number of policy researchers</w:t>
+            </w:r>
+          </w:p>
+        </w:tc>
+        <w:tc>
+          <w:tcPr>
+            <w:tcW w:type="dxa" w:w="2160"/>
+          </w:tcPr>
+          <w:p>
+            <w:r>
+              <w:t>2026-10-02</w:t>
+            </w:r>
+          </w:p>
+        </w:tc>
+      </w:tr>
+      <w:tr>
+        <w:tc>
+          <w:tcPr>
+            <w:tcW w:type="dxa" w:w="2160"/>
+          </w:tcPr>
+          <w:p>
+            <w:r>
+              <w:t>blanket</w:t>
+            </w:r>
+          </w:p>
+        </w:tc>
+        <w:tc>
+          <w:tcPr>
+            <w:tcW w:type="dxa" w:w="2160"/>
+          </w:tcPr>
+          <w:p>
+            <w:r>
+              <w:t>adj.</w:t>
+            </w:r>
+          </w:p>
+        </w:tc>
+        <w:tc>
+          <w:tcPr>
+            <w:tcW w:type="dxa" w:w="2160"/>
+          </w:tcPr>
+          <w:p>
+            <w:r>
+              <w:t>全面的，一刀切的（a blanket ban / blanket cynicism；由 n. 毯子→“覆盖一切的”）；原文 Although British voters prefer the asses in Devon to the asses in Westminster, their blanket cynicism about politics is unwarranted</w:t>
+            </w:r>
+          </w:p>
+        </w:tc>
+        <w:tc>
+          <w:tcPr>
+            <w:tcW w:type="dxa" w:w="2160"/>
+          </w:tcPr>
+          <w:p>
+            <w:r>
+              <w:t>2026-10-02</w:t>
+            </w:r>
+          </w:p>
+        </w:tc>
+      </w:tr>
+      <w:tr>
+        <w:tc>
+          <w:tcPr>
+            <w:tcW w:type="dxa" w:w="2160"/>
+          </w:tcPr>
+          <w:p>
+            <w:r>
+              <w:t>stigmatize</w:t>
+            </w:r>
+          </w:p>
+        </w:tc>
+        <w:tc>
+          <w:tcPr>
+            <w:tcW w:type="dxa" w:w="2160"/>
+          </w:tcPr>
+          <w:p>
+            <w:r>
+              <w:t>v.</w:t>
+            </w:r>
+          </w:p>
+        </w:tc>
+        <w:tc>
+          <w:tcPr>
+            <w:tcW w:type="dxa" w:w="2160"/>
+          </w:tcPr>
+          <w:p>
+            <w:r>
+              <w:t>污名化，使蒙羞（be stigmatised as…；名词 stigma 耻辱、烙印）；原文 if giving to political parties is stigmatised as spivvy, only spivs will give</w:t>
+            </w:r>
+          </w:p>
+        </w:tc>
+        <w:tc>
+          <w:tcPr>
+            <w:tcW w:type="dxa" w:w="2160"/>
+          </w:tcPr>
+          <w:p>
+            <w:r>
+              <w:t>2026-10-02</w:t>
+            </w:r>
+          </w:p>
+        </w:tc>
+      </w:tr>
+      <w:tr>
+        <w:tc>
+          <w:tcPr>
+            <w:tcW w:type="dxa" w:w="2160"/>
+          </w:tcPr>
+          <w:p>
+            <w:r>
+              <w:t>shun</w:t>
+            </w:r>
+          </w:p>
+        </w:tc>
+        <w:tc>
+          <w:tcPr>
+            <w:tcW w:type="dxa" w:w="2160"/>
+          </w:tcPr>
+          <w:p>
+            <w:r>
+              <w:t>v.</w:t>
+            </w:r>
+          </w:p>
+        </w:tc>
+        <w:tc>
+          <w:tcPr>
+            <w:tcW w:type="dxa" w:w="2160"/>
+          </w:tcPr>
+          <w:p>
+            <w:r>
+              <w:t>（刻意）回避，避开（shun publicity / the limelight）；原文 If you are an opponent of Reform, you should shun the donkeys this year and pick the party you want to win</w:t>
+            </w:r>
+          </w:p>
+        </w:tc>
+        <w:tc>
+          <w:tcPr>
+            <w:tcW w:type="dxa" w:w="2160"/>
+          </w:tcPr>
+          <w:p>
+            <w:r>
+              <w:t>2026-10-02</w:t>
+            </w:r>
+          </w:p>
+        </w:tc>
+      </w:tr>
+      <w:tr>
+        <w:tc>
+          <w:tcPr>
+            <w:tcW w:type="dxa" w:w="2160"/>
+          </w:tcPr>
+          <w:p>
+            <w:r>
+              <w:t>skyrocket</w:t>
+            </w:r>
+          </w:p>
+        </w:tc>
+        <w:tc>
+          <w:tcPr>
+            <w:tcW w:type="dxa" w:w="2160"/>
+          </w:tcPr>
+          <w:p>
+            <w:r>
+              <w:t>v.</w:t>
+            </w:r>
+          </w:p>
+        </w:tc>
+        <w:tc>
+          <w:tcPr>
+            <w:tcW w:type="dxa" w:w="2160"/>
+          </w:tcPr>
+          <w:p>
+            <w:r>
+              <w:t>飞涨，猛升（skyrocketing prices / inequality；像烟花一样窜上天）；原文 half a century of booms and busts, skyrocketing inequality, terrorist attacks…</w:t>
+            </w:r>
+          </w:p>
+        </w:tc>
+        <w:tc>
+          <w:tcPr>
+            <w:tcW w:type="dxa" w:w="2160"/>
+          </w:tcPr>
+          <w:p>
+            <w:r>
+              <w:t>2026-10-02</w:t>
+            </w:r>
+          </w:p>
+        </w:tc>
+      </w:tr>
+      <w:tr>
+        <w:tc>
+          <w:tcPr>
+            <w:tcW w:type="dxa" w:w="2160"/>
+          </w:tcPr>
+          <w:p>
+            <w:r>
+              <w:t>divisive</w:t>
+            </w:r>
+          </w:p>
+        </w:tc>
+        <w:tc>
+          <w:tcPr>
+            <w:tcW w:type="dxa" w:w="2160"/>
+          </w:tcPr>
+          <w:p>
+            <w:r>
+              <w:t>adj.</w:t>
+            </w:r>
+          </w:p>
+        </w:tc>
+        <w:tc>
+          <w:tcPr>
+            <w:tcW w:type="dxa" w:w="2160"/>
+          </w:tcPr>
+          <w:p>
+            <w:r>
+              <w:t>造成分裂的，引起争议的（a divisive figure / issue；动词 divide→divisive）；原文 revolutionary technologies, divisive new politics, menacing new weather</w:t>
+            </w:r>
+          </w:p>
+        </w:tc>
+        <w:tc>
+          <w:tcPr>
+            <w:tcW w:type="dxa" w:w="2160"/>
+          </w:tcPr>
+          <w:p>
+            <w:r>
+              <w:t>2026-10-02</w:t>
+            </w:r>
+          </w:p>
+        </w:tc>
+      </w:tr>
+      <w:tr>
+        <w:tc>
+          <w:tcPr>
+            <w:tcW w:type="dxa" w:w="2160"/>
+          </w:tcPr>
+          <w:p>
+            <w:r>
+              <w:t>swoop</w:t>
+            </w:r>
+          </w:p>
+        </w:tc>
+        <w:tc>
+          <w:tcPr>
+            <w:tcW w:type="dxa" w:w="2160"/>
+          </w:tcPr>
+          <w:p>
+            <w:r>
+              <w:t>v. / n.</w:t>
+            </w:r>
+          </w:p>
+        </w:tc>
+        <w:tc>
+          <w:tcPr>
+            <w:tcW w:type="dxa" w:w="2160"/>
+          </w:tcPr>
+          <w:p>
+            <w:r>
+              <w:t>猛扑，俯冲；（警方）突然行动（swoop down on…）；原文 pigeons swooping to and fro in the intersection below his office</w:t>
+            </w:r>
+          </w:p>
+        </w:tc>
+        <w:tc>
+          <w:tcPr>
+            <w:tcW w:type="dxa" w:w="2160"/>
+          </w:tcPr>
+          <w:p>
+            <w:r>
+              <w:t>2026-10-02</w:t>
+            </w:r>
+          </w:p>
+        </w:tc>
+      </w:tr>
+      <w:tr>
+        <w:tc>
+          <w:tcPr>
+            <w:tcW w:type="dxa" w:w="2160"/>
+          </w:tcPr>
+          <w:p>
+            <w:r>
+              <w:t>grimace</w:t>
+            </w:r>
+          </w:p>
+        </w:tc>
+        <w:tc>
+          <w:tcPr>
+            <w:tcW w:type="dxa" w:w="2160"/>
+          </w:tcPr>
+          <w:p>
+            <w:r>
+              <w:t>v. / n.</w:t>
+            </w:r>
+          </w:p>
+        </w:tc>
+        <w:tc>
+          <w:tcPr>
+            <w:tcW w:type="dxa" w:w="2160"/>
+          </w:tcPr>
+          <w:p>
+            <w:r>
+              <w:t>（痛苦、厌恶时）做怪相，皱眉蹙额（grimace at / with pain）；原文 He grimaced as Dixon skimmed through a segment about the twisty 2001 mayoral race</w:t>
+            </w:r>
+          </w:p>
+        </w:tc>
+        <w:tc>
+          <w:tcPr>
+            <w:tcW w:type="dxa" w:w="2160"/>
+          </w:tcPr>
+          <w:p>
+            <w:r>
+              <w:t>2026-10-02</w:t>
+            </w:r>
+          </w:p>
+        </w:tc>
+      </w:tr>
+      <w:tr>
+        <w:tc>
+          <w:tcPr>
+            <w:tcW w:type="dxa" w:w="2160"/>
+          </w:tcPr>
+          <w:p>
+            <w:r>
+              <w:t>trail</w:t>
+            </w:r>
+          </w:p>
+        </w:tc>
+        <w:tc>
+          <w:tcPr>
+            <w:tcW w:type="dxa" w:w="2160"/>
+          </w:tcPr>
+          <w:p>
+            <w:r>
+              <w:t>v.</w:t>
+            </w:r>
+          </w:p>
+        </w:tc>
+        <w:tc>
+          <w:tcPr>
+            <w:tcW w:type="dxa" w:w="2160"/>
+          </w:tcPr>
+          <w:p>
+            <w:r>
+              <w:t>（选举、比赛中）落后（trail sb by 5 points / trail in the polls；注意区别 n. 小径、踪迹）；原文 Until that morning, Bloomberg had trailed badly in the polls</w:t>
+            </w:r>
+          </w:p>
+        </w:tc>
+        <w:tc>
+          <w:tcPr>
+            <w:tcW w:type="dxa" w:w="2160"/>
+          </w:tcPr>
+          <w:p>
+            <w:r>
+              <w:t>2026-10-02</w:t>
+            </w:r>
+          </w:p>
+        </w:tc>
+      </w:tr>
+      <w:tr>
+        <w:tc>
+          <w:tcPr>
+            <w:tcW w:type="dxa" w:w="2160"/>
+          </w:tcPr>
+          <w:p>
+            <w:r>
+              <w:t>martial law</w:t>
+            </w:r>
+          </w:p>
+        </w:tc>
+        <w:tc>
+          <w:tcPr>
+            <w:tcW w:type="dxa" w:w="2160"/>
+          </w:tcPr>
+          <w:p>
+            <w:r>
+              <w:t>n.</w:t>
+            </w:r>
+          </w:p>
+        </w:tc>
+        <w:tc>
+          <w:tcPr>
+            <w:tcW w:type="dxa" w:w="2160"/>
+          </w:tcPr>
+          <w:p>
+            <w:r>
+              <w:t>戒严，军事管制（impose / declare martial law 实施戒严；martial 军事的，与 marshal 元帅区分）；原文 the future of the city looked bleaker than at any time since the British imposed martial law, in 1776</w:t>
+            </w:r>
+          </w:p>
+        </w:tc>
+        <w:tc>
+          <w:tcPr>
+            <w:tcW w:type="dxa" w:w="2160"/>
+          </w:tcPr>
+          <w:p>
+            <w:r>
+              <w:t>2026-10-02</w:t>
+            </w:r>
+          </w:p>
+        </w:tc>
+      </w:tr>
+      <w:tr>
+        <w:tc>
+          <w:tcPr>
+            <w:tcW w:type="dxa" w:w="2160"/>
+          </w:tcPr>
+          <w:p>
+            <w:r>
+              <w:t>gash</w:t>
+            </w:r>
+          </w:p>
+        </w:tc>
+        <w:tc>
+          <w:tcPr>
+            <w:tcW w:type="dxa" w:w="2160"/>
+          </w:tcPr>
+          <w:p>
+            <w:r>
+              <w:t>n. / v.</w:t>
+            </w:r>
+          </w:p>
+        </w:tc>
+        <w:tc>
+          <w:tcPr>
+            <w:tcW w:type="dxa" w:w="2160"/>
+          </w:tcPr>
+          <w:p>
+            <w:r>
+              <w:t>深长的伤口，划伤（a two-inch gash；比 cut 深，比 scratch 重）；原文 “You may wonder why I have a two-inch gash on my head,” he said</w:t>
+            </w:r>
+          </w:p>
+        </w:tc>
+        <w:tc>
+          <w:tcPr>
+            <w:tcW w:type="dxa" w:w="2160"/>
+          </w:tcPr>
+          <w:p>
+            <w:r>
+              <w:t>2026-10-02</w:t>
+            </w:r>
+          </w:p>
+        </w:tc>
+      </w:tr>
+      <w:tr>
+        <w:tc>
+          <w:tcPr>
+            <w:tcW w:type="dxa" w:w="2160"/>
+          </w:tcPr>
+          <w:p>
+            <w:r>
+              <w:t>lingerie</w:t>
+            </w:r>
+          </w:p>
+        </w:tc>
+        <w:tc>
+          <w:tcPr>
+            <w:tcW w:type="dxa" w:w="2160"/>
+          </w:tcPr>
+          <w:p>
+            <w:r>
+              <w:t>n.</w:t>
+            </w:r>
+          </w:p>
+        </w:tc>
+        <w:tc>
+          <w:tcPr>
+            <w:tcW w:type="dxa" w:w="2160"/>
+          </w:tcPr>
+          <w:p>
+            <w:r>
+              <w:t>女式内衣（源自法语，读 /ˈlɒnʒəreɪ/；同义 intimates / undergarments）；原文 Five Books for Lingerie Lovers（内衣迷的五本书）</w:t>
+            </w:r>
+          </w:p>
+        </w:tc>
+        <w:tc>
+          <w:tcPr>
+            <w:tcW w:type="dxa" w:w="2160"/>
+          </w:tcPr>
+          <w:p>
+            <w:r>
+              <w:t>2026-10-02</w:t>
+            </w:r>
+          </w:p>
+        </w:tc>
+      </w:tr>
+      <w:tr>
+        <w:tc>
+          <w:tcPr>
+            <w:tcW w:type="dxa" w:w="2160"/>
+          </w:tcPr>
+          <w:p>
+            <w:r>
+              <w:t>unravel</w:t>
+            </w:r>
+          </w:p>
+        </w:tc>
+        <w:tc>
+          <w:tcPr>
+            <w:tcW w:type="dxa" w:w="2160"/>
+          </w:tcPr>
+          <w:p>
+            <w:r>
+              <w:t>v.</w:t>
+            </w:r>
+          </w:p>
+        </w:tc>
+        <w:tc>
+          <w:tcPr>
+            <w:tcW w:type="dxa" w:w="2160"/>
+          </w:tcPr>
+          <w:p>
+            <w:r>
+              <w:t>解开（线团）；瓦解，崩溃， unravel plans / a marriage 开始瓦解；un-（反）+ ravel（缠结））；原文 Selling Sexy: Victoria's Secret and the Unraveling of an American Icon</w:t>
+            </w:r>
+          </w:p>
+        </w:tc>
+        <w:tc>
+          <w:tcPr>
+            <w:tcW w:type="dxa" w:w="2160"/>
+          </w:tcPr>
+          <w:p>
+            <w:r>
+              <w:t>2026-10-02</w:t>
+            </w:r>
+          </w:p>
+        </w:tc>
+      </w:tr>
+      <w:tr>
+        <w:tc>
+          <w:tcPr>
+            <w:tcW w:type="dxa" w:w="2160"/>
+          </w:tcPr>
+          <w:p>
+            <w:r>
+              <w:t>acumen</w:t>
+            </w:r>
+          </w:p>
+        </w:tc>
+        <w:tc>
+          <w:tcPr>
+            <w:tcW w:type="dxa" w:w="2160"/>
+          </w:tcPr>
+          <w:p>
+            <w:r>
+              <w:t>n.</w:t>
+            </w:r>
+          </w:p>
+        </w:tc>
+        <w:tc>
+          <w:tcPr>
+            <w:tcW w:type="dxa" w:w="2160"/>
+          </w:tcPr>
+          <w:p>
+            <w:r>
+              <w:t>敏锐，精明（business / political acumen 商业/政治头脑；读 /ˈækjəmən/）；原文 Victoria Stewart-White gets her business acumen from her father, a “wry but quiet English financier”</w:t>
+            </w:r>
+          </w:p>
+        </w:tc>
+        <w:tc>
+          <w:tcPr>
+            <w:tcW w:type="dxa" w:w="2160"/>
+          </w:tcPr>
+          <w:p>
+            <w:r>
+              <w:t>2026-10-02</w:t>
+            </w:r>
+          </w:p>
+        </w:tc>
+      </w:tr>
+      <w:tr>
+        <w:tc>
+          <w:tcPr>
+            <w:tcW w:type="dxa" w:w="2160"/>
+          </w:tcPr>
+          <w:p>
+            <w:r>
+              <w:t>wry</w:t>
+            </w:r>
+          </w:p>
+        </w:tc>
+        <w:tc>
+          <w:tcPr>
+            <w:tcW w:type="dxa" w:w="2160"/>
+          </w:tcPr>
+          <w:p>
+            <w:r>
+              <w:t>adj.</w:t>
+            </w:r>
+          </w:p>
+        </w:tc>
+        <w:tc>
+          <w:tcPr>
+            <w:tcW w:type="dxa" w:w="2160"/>
+          </w:tcPr>
+          <w:p>
+            <w:r>
+              <w:t>（幽默）揶揄的，冷嘲的；歪斜的（a wry smile / a wry comment）；原文 her father, a “wry but quiet English financier”</w:t>
+            </w:r>
+          </w:p>
+        </w:tc>
+        <w:tc>
+          <w:tcPr>
+            <w:tcW w:type="dxa" w:w="2160"/>
+          </w:tcPr>
+          <w:p>
+            <w:r>
+              <w:t>2026-10-02</w:t>
+            </w:r>
+          </w:p>
+        </w:tc>
+      </w:tr>
+      <w:tr>
+        <w:tc>
+          <w:tcPr>
+            <w:tcW w:type="dxa" w:w="2160"/>
+          </w:tcPr>
+          <w:p>
+            <w:r>
+              <w:t>frequent</w:t>
+            </w:r>
+          </w:p>
+        </w:tc>
+        <w:tc>
+          <w:tcPr>
+            <w:tcW w:type="dxa" w:w="2160"/>
+          </w:tcPr>
+          <w:p>
+            <w:r>
+              <w:t>v.</w:t>
+            </w:r>
+          </w:p>
+        </w:tc>
+        <w:tc>
+          <w:tcPr>
+            <w:tcW w:type="dxa" w:w="2160"/>
+          </w:tcPr>
+          <w:p>
+            <w:r>
+              <w:t>常去，常光顾（动词读 /friˈkwent/，重音后移，区别 adj. 频繁的 /ˈfriːkwənt/）；原文 her first lingerie shop becomes the “toast of London” after it's frequented by her friends, as “all her friends are models”</w:t>
+            </w:r>
+          </w:p>
+        </w:tc>
+        <w:tc>
+          <w:tcPr>
+            <w:tcW w:type="dxa" w:w="2160"/>
+          </w:tcPr>
+          <w:p>
+            <w:r>
+              <w:t>2026-10-02</w:t>
+            </w:r>
+          </w:p>
+        </w:tc>
+      </w:tr>
+      <w:tr>
+        <w:tc>
+          <w:tcPr>
+            <w:tcW w:type="dxa" w:w="2160"/>
+          </w:tcPr>
+          <w:p>
+            <w:r>
+              <w:t>snag</w:t>
+            </w:r>
+          </w:p>
+        </w:tc>
+        <w:tc>
+          <w:tcPr>
+            <w:tcW w:type="dxa" w:w="2160"/>
+          </w:tcPr>
+          <w:p>
+            <w:r>
+              <w:t>v. / n.</w:t>
+            </w:r>
+          </w:p>
+        </w:tc>
+        <w:tc>
+          <w:tcPr>
+            <w:tcW w:type="dxa" w:w="2160"/>
+          </w:tcPr>
+          <w:p>
+            <w:r>
+              <w:t>勾住，挂破；（喻）碰上意想不到的小麻烦（a snag in the plan / hit a snag）；原文 Fingernails always snagging your pantyhose as you put them on?</w:t>
+            </w:r>
+          </w:p>
+        </w:tc>
+        <w:tc>
+          <w:tcPr>
+            <w:tcW w:type="dxa" w:w="2160"/>
+          </w:tcPr>
+          <w:p>
+            <w:r>
+              <w:t>2026-10-02</w:t>
+            </w:r>
+          </w:p>
+        </w:tc>
+      </w:tr>
+      <w:tr>
+        <w:tc>
+          <w:tcPr>
+            <w:tcW w:type="dxa" w:w="2160"/>
+          </w:tcPr>
+          <w:p>
+            <w:r>
+              <w:t>suitor</w:t>
+            </w:r>
+          </w:p>
+        </w:tc>
+        <w:tc>
+          <w:tcPr>
+            <w:tcW w:type="dxa" w:w="2160"/>
+          </w:tcPr>
+          <w:p>
+            <w:r>
+              <w:t>n.</w:t>
+            </w:r>
+          </w:p>
+        </w:tc>
+        <w:tc>
+          <w:tcPr>
+            <w:tcW w:type="dxa" w:w="2160"/>
+          </w:tcPr>
+          <w:p>
+            <w:r>
+              <w:t>求婚者，追求者；（商业）竞购方（动词 pursue→名词 suitor）；原文 Her city friends are no saints themselves, though. One collects bras…; her suitors are fittingly nicknamed “pioneers”</w:t>
+            </w:r>
+          </w:p>
+        </w:tc>
+        <w:tc>
+          <w:tcPr>
+            <w:tcW w:type="dxa" w:w="2160"/>
+          </w:tcPr>
+          <w:p>
+            <w:r>
+              <w:t>2026-10-02</w:t>
+            </w:r>
+          </w:p>
+        </w:tc>
+      </w:tr>
+      <w:tr>
+        <w:tc>
+          <w:tcPr>
+            <w:tcW w:type="dxa" w:w="2160"/>
+          </w:tcPr>
+          <w:p>
+            <w:r>
+              <w:t>altruism</w:t>
+            </w:r>
+          </w:p>
+        </w:tc>
+        <w:tc>
+          <w:tcPr>
+            <w:tcW w:type="dxa" w:w="2160"/>
+          </w:tcPr>
+          <w:p>
+            <w:r>
+              <w:t>n.</w:t>
+            </w:r>
+          </w:p>
+        </w:tc>
+        <w:tc>
+          <w:tcPr>
+            <w:tcW w:type="dxa" w:w="2160"/>
+          </w:tcPr>
+          <w:p>
+            <w:r>
+              <w:t>利他主义，无私（effective altruism 有效利他主义；altruist n. 利他主义者；反义 egoism 自我主义）；原文 Effective altruism is this century's biggest idea | The movement is admirable, but dangerous</w:t>
+            </w:r>
+          </w:p>
+        </w:tc>
+        <w:tc>
+          <w:tcPr>
+            <w:tcW w:type="dxa" w:w="2160"/>
+          </w:tcPr>
+          <w:p>
+            <w:r>
+              <w:t>2026-10-02</w:t>
+            </w:r>
+          </w:p>
+        </w:tc>
+      </w:tr>
+      <w:tr>
+        <w:tc>
+          <w:tcPr>
+            <w:tcW w:type="dxa" w:w="2160"/>
+          </w:tcPr>
+          <w:p>
+            <w:r>
+              <w:t>throttle</w:t>
+            </w:r>
+          </w:p>
+        </w:tc>
+        <w:tc>
+          <w:tcPr>
+            <w:tcW w:type="dxa" w:w="2160"/>
+          </w:tcPr>
+          <w:p>
+            <w:r>
+              <w:t>v.</w:t>
+            </w:r>
+          </w:p>
+        </w:tc>
+        <w:tc>
+          <w:tcPr>
+            <w:tcW w:type="dxa" w:w="2160"/>
+          </w:tcPr>
+          <w:p>
+            <w:r>
+              <w:t>掐死，扼杀；压制，阻碍（throttle AI / an industry；本义“掐住喉咙”）；原文 The Trump administration fears the movement will succeed in throttling AI</w:t>
+            </w:r>
+          </w:p>
+        </w:tc>
+        <w:tc>
+          <w:tcPr>
+            <w:tcW w:type="dxa" w:w="2160"/>
+          </w:tcPr>
+          <w:p>
+            <w:r>
+              <w:t>2026-10-02</w:t>
+            </w:r>
+          </w:p>
+        </w:tc>
+      </w:tr>
+      <w:tr>
+        <w:tc>
+          <w:tcPr>
+            <w:tcW w:type="dxa" w:w="2160"/>
+          </w:tcPr>
+          <w:p>
+            <w:r>
+              <w:t>feud</w:t>
+            </w:r>
+          </w:p>
+        </w:tc>
+        <w:tc>
+          <w:tcPr>
+            <w:tcW w:type="dxa" w:w="2160"/>
+          </w:tcPr>
+          <w:p>
+            <w:r>
+              <w:t>v. / n.</w:t>
+            </w:r>
+          </w:p>
+        </w:tc>
+        <w:tc>
+          <w:tcPr>
+            <w:tcW w:type="dxa" w:w="2160"/>
+          </w:tcPr>
+          <w:p>
+            <w:r>
+              <w:t>长期争斗，宿怨（feud with sb over sth；blood feud 血亲复仇）；原文 It has feuded with Anthropic over the firm's refusal to let its models be used for some military purposes</w:t>
+            </w:r>
+          </w:p>
+        </w:tc>
+        <w:tc>
+          <w:tcPr>
+            <w:tcW w:type="dxa" w:w="2160"/>
+          </w:tcPr>
+          <w:p>
+            <w:r>
+              <w:t>2026-10-02</w:t>
+            </w:r>
+          </w:p>
+        </w:tc>
+      </w:tr>
+      <w:tr>
+        <w:tc>
+          <w:tcPr>
+            <w:tcW w:type="dxa" w:w="2160"/>
+          </w:tcPr>
+          <w:p>
+            <w:r>
+              <w:t>benign</w:t>
+            </w:r>
+          </w:p>
+        </w:tc>
+        <w:tc>
+          <w:tcPr>
+            <w:tcW w:type="dxa" w:w="2160"/>
+          </w:tcPr>
+          <w:p>
+            <w:r>
+              <w:t>adj.</w:t>
+            </w:r>
+          </w:p>
+        </w:tc>
+        <w:tc>
+          <w:tcPr>
+            <w:tcW w:type="dxa" w:w="2160"/>
+          </w:tcPr>
+          <w:p>
+            <w:r>
+              <w:t>良性的，无害的，和善的（a benign tumour 良性肿瘤；反义 malignant 恶性的）；原文 Leading EAs acknowledge that AI may prove hugely benign, but nonetheless want to slow its development</w:t>
+            </w:r>
+          </w:p>
+        </w:tc>
+        <w:tc>
+          <w:tcPr>
+            <w:tcW w:type="dxa" w:w="2160"/>
+          </w:tcPr>
+          <w:p>
+            <w:r>
+              <w:t>2026-10-02</w:t>
+            </w:r>
+          </w:p>
+        </w:tc>
+      </w:tr>
+      <w:tr>
+        <w:tc>
+          <w:tcPr>
+            <w:tcW w:type="dxa" w:w="2160"/>
+          </w:tcPr>
+          <w:p>
+            <w:r>
+              <w:t>utilitarian</w:t>
+            </w:r>
+          </w:p>
+        </w:tc>
+        <w:tc>
+          <w:tcPr>
+            <w:tcW w:type="dxa" w:w="2160"/>
+          </w:tcPr>
+          <w:p>
+            <w:r>
+              <w:t>adj. / n.</w:t>
+            </w:r>
+          </w:p>
+        </w:tc>
+        <w:tc>
+          <w:tcPr>
+            <w:tcW w:type="dxa" w:w="2160"/>
+          </w:tcPr>
+          <w:p>
+            <w:r>
+              <w:t>功利主义的；实用的，只讲实惠的（utilitarian philosophers 功利主义哲学家；utilitarianism 功利主义）；原文 Like the utilitarian philosophers before them, EAs boil ethical behaviour down to an optimisation problem</w:t>
+            </w:r>
+          </w:p>
+        </w:tc>
+        <w:tc>
+          <w:tcPr>
+            <w:tcW w:type="dxa" w:w="2160"/>
+          </w:tcPr>
+          <w:p>
+            <w:r>
+              <w:t>2026-10-02</w:t>
+            </w:r>
+          </w:p>
+        </w:tc>
+      </w:tr>
+      <w:tr>
+        <w:tc>
+          <w:tcPr>
+            <w:tcW w:type="dxa" w:w="2160"/>
+          </w:tcPr>
+          <w:p>
+            <w:r>
+              <w:t>boil down to</w:t>
+            </w:r>
+          </w:p>
+        </w:tc>
+        <w:tc>
+          <w:tcPr>
+            <w:tcW w:type="dxa" w:w="2160"/>
+          </w:tcPr>
+          <w:p>
+            <w:r>
+              <w:t>phr.</w:t>
+            </w:r>
+          </w:p>
+        </w:tc>
+        <w:tc>
+          <w:tcPr>
+            <w:tcW w:type="dxa" w:w="2160"/>
+          </w:tcPr>
+          <w:p>
+            <w:r>
+              <w:t>归根结底是，归结为（It boils down to money 说到底就是钱的问题）；原文 EAs boil ethical behaviour down to an optimisation problem</w:t>
+            </w:r>
+          </w:p>
+        </w:tc>
+        <w:tc>
+          <w:tcPr>
+            <w:tcW w:type="dxa" w:w="2160"/>
+          </w:tcPr>
+          <w:p>
+            <w:r>
+              <w:t>2026-10-02</w:t>
+            </w:r>
+          </w:p>
+        </w:tc>
+      </w:tr>
+      <w:tr>
+        <w:tc>
+          <w:tcPr>
+            <w:tcW w:type="dxa" w:w="2160"/>
+          </w:tcPr>
+          <w:p>
+            <w:r>
+              <w:t>counterintuitive</w:t>
+            </w:r>
+          </w:p>
+        </w:tc>
+        <w:tc>
+          <w:tcPr>
+            <w:tcW w:type="dxa" w:w="2160"/>
+          </w:tcPr>
+          <w:p>
+            <w:r>
+              <w:t>adj.</w:t>
+            </w:r>
+          </w:p>
+        </w:tc>
+        <w:tc>
+          <w:tcPr>
+            <w:tcW w:type="dxa" w:w="2160"/>
+          </w:tcPr>
+          <w:p>
+            <w:r>
+              <w:t>反直觉的，违反常识的（counter-（相反）+ intuitive（直觉的））；原文 they have a counterintuitive approach to time / EAs enjoy counterintuitive conclusions</w:t>
+            </w:r>
+          </w:p>
+        </w:tc>
+        <w:tc>
+          <w:tcPr>
+            <w:tcW w:type="dxa" w:w="2160"/>
+          </w:tcPr>
+          <w:p>
+            <w:r>
+              <w:t>2026-10-02</w:t>
+            </w:r>
+          </w:p>
+        </w:tc>
+      </w:tr>
+      <w:tr>
+        <w:tc>
+          <w:tcPr>
+            <w:tcW w:type="dxa" w:w="2160"/>
+          </w:tcPr>
+          <w:p>
+            <w:r>
+              <w:t>perverse</w:t>
+            </w:r>
+          </w:p>
+        </w:tc>
+        <w:tc>
+          <w:tcPr>
+            <w:tcW w:type="dxa" w:w="2160"/>
+          </w:tcPr>
+          <w:p>
+            <w:r>
+              <w:t>adj.</w:t>
+            </w:r>
+          </w:p>
+        </w:tc>
+        <w:tc>
+          <w:tcPr>
+            <w:tcW w:type="dxa" w:w="2160"/>
+          </w:tcPr>
+          <w:p>
+            <w:r>
+              <w:t>有悖常理的，反常的；执拗的（a perverse conclusion / incentive；名词 perversity）；原文 EAs' instinct is to enjoy counterintuitive conclusions, even if they seem perverse</w:t>
+            </w:r>
+          </w:p>
+        </w:tc>
+        <w:tc>
+          <w:tcPr>
+            <w:tcW w:type="dxa" w:w="2160"/>
+          </w:tcPr>
+          <w:p>
+            <w:r>
+              <w:t>2026-10-02</w:t>
+            </w:r>
+          </w:p>
+        </w:tc>
+      </w:tr>
+      <w:tr>
+        <w:tc>
+          <w:tcPr>
+            <w:tcW w:type="dxa" w:w="2160"/>
+          </w:tcPr>
+          <w:p>
+            <w:r>
+              <w:t>dire</w:t>
+            </w:r>
+          </w:p>
+        </w:tc>
+        <w:tc>
+          <w:tcPr>
+            <w:tcW w:type="dxa" w:w="2160"/>
+          </w:tcPr>
+          <w:p>
+            <w:r>
+              <w:t>adj.</w:t>
+            </w:r>
+          </w:p>
+        </w:tc>
+        <w:tc>
+          <w:tcPr>
+            <w:tcW w:type="dxa" w:w="2160"/>
+          </w:tcPr>
+          <w:p>
+            <w:r>
+              <w:t>极其严重的，危急的（in dire straits / dire consequences / a dire warning）；原文 extinction is so dire that in a crude moral arithmetic even a small chance of it overpowers today's flesh-and-blood concerns</w:t>
+            </w:r>
+          </w:p>
+        </w:tc>
+        <w:tc>
+          <w:tcPr>
+            <w:tcW w:type="dxa" w:w="2160"/>
+          </w:tcPr>
+          <w:p>
+            <w:r>
+              <w:t>2026-10-02</w:t>
+            </w:r>
+          </w:p>
+        </w:tc>
+      </w:tr>
+      <w:tr>
+        <w:tc>
+          <w:tcPr>
+            <w:tcW w:type="dxa" w:w="2160"/>
+          </w:tcPr>
+          <w:p>
+            <w:r>
+              <w:t>wield</w:t>
+            </w:r>
+          </w:p>
+        </w:tc>
+        <w:tc>
+          <w:tcPr>
+            <w:tcW w:type="dxa" w:w="2160"/>
+          </w:tcPr>
+          <w:p>
+            <w:r>
+              <w:t>v.</w:t>
+            </w:r>
+          </w:p>
+        </w:tc>
+        <w:tc>
+          <w:tcPr>
+            <w:tcW w:type="dxa" w:w="2160"/>
+          </w:tcPr>
+          <w:p>
+            <w:r>
+              <w:t>挥舞（武器、工具）；行使，运用（权力、影响）（wield power / influence 大权在握）；原文 Anyone wielding a spreadsheet and grandiose claims about the future of humanity is one step away from anointing themself as a central planner</w:t>
+            </w:r>
+          </w:p>
+        </w:tc>
+        <w:tc>
+          <w:tcPr>
+            <w:tcW w:type="dxa" w:w="2160"/>
+          </w:tcPr>
+          <w:p>
+            <w:r>
+              <w:t>2026-10-02</w:t>
+            </w:r>
+          </w:p>
+        </w:tc>
+      </w:tr>
+      <w:tr>
+        <w:tc>
+          <w:tcPr>
+            <w:tcW w:type="dxa" w:w="2160"/>
+          </w:tcPr>
+          <w:p>
+            <w:r>
+              <w:t>downplay</w:t>
+            </w:r>
+          </w:p>
+        </w:tc>
+        <w:tc>
+          <w:tcPr>
+            <w:tcW w:type="dxa" w:w="2160"/>
+          </w:tcPr>
+          <w:p>
+            <w:r>
+              <w:t>v.</w:t>
+            </w:r>
+          </w:p>
+        </w:tc>
+        <w:tc>
+          <w:tcPr>
+            <w:tcW w:type="dxa" w:w="2160"/>
+          </w:tcPr>
+          <w:p>
+            <w:r>
+              <w:t>淡化，低估，轻描淡写（downplay the risks / one's role；反义 play up 夸大、突出）；原文 Their calculus downplays local imperatives such as “keep promises” or “look after your family”</w:t>
+            </w:r>
+          </w:p>
+        </w:tc>
+        <w:tc>
+          <w:tcPr>
+            <w:tcW w:type="dxa" w:w="2160"/>
+          </w:tcPr>
+          <w:p>
+            <w:r>
+              <w:t>2026-10-02</w:t>
             </w:r>
           </w:p>
         </w:tc>

</xml_diff>

<commit_message>
update: 2026-10-03 期《The Sublime Somi Bridges African and Western Jazz》
</commit_message>
<xml_diff>
--- a/生词本/单词本.docx
+++ b/生词本/单词本.docx
@@ -7404,6 +7404,48 @@
           <w:p>
             <w:r>
               <w:t>2026-10-02</w:t>
+            </w:r>
+          </w:p>
+        </w:tc>
+      </w:tr>
+      <w:tr>
+        <w:tc>
+          <w:tcPr>
+            <w:tcW w:type="dxa" w:w="2160"/>
+          </w:tcPr>
+          <w:p>
+            <w:r>
+              <w:t>webview</w:t>
+            </w:r>
+          </w:p>
+        </w:tc>
+        <w:tc>
+          <w:tcPr>
+            <w:tcW w:type="dxa" w:w="2160"/>
+          </w:tcPr>
+          <w:p>
+            <w:r>
+              <w:t>n.</w:t>
+            </w:r>
+          </w:p>
+        </w:tc>
+        <w:tc>
+          <w:tcPr>
+            <w:tcW w:type="dxa" w:w="2160"/>
+          </w:tcPr>
+          <w:p>
+            <w:r>
+              <w:t>网页视图；内嵌在原生应用里的浏览器组件，让 App、桌面程序或编辑器在自己的界面内直接加载显示网页，如 Android 的 WebView、iOS 的 WKWebView、Windows 的 WebView2。例句：The app opens the article in a WebView instead of an external browser.</w:t>
+            </w:r>
+          </w:p>
+        </w:tc>
+        <w:tc>
+          <w:tcPr>
+            <w:tcW w:type="dxa" w:w="2160"/>
+          </w:tcPr>
+          <w:p>
+            <w:r>
+              <w:t>2026-10-03</w:t>
             </w:r>
           </w:p>
         </w:tc>

</xml_diff>